<commit_message>
Add software requirements section
</commit_message>
<xml_diff>
--- a/report/PRT581_CyberAware_Final_Report_Darwin_Group_21.docx
+++ b/report/PRT581_CyberAware_Final_Report_Darwin_Group_21.docx
@@ -14,13 +14,8 @@
     </w:p>
     <w:p/>
     <w:p>
-      <w:proofErr w:type="spellStart"/>
-      <w:r>
-        <w:t>CyberAware</w:t>
-      </w:r>
-      <w:proofErr w:type="spellEnd"/>
-      <w:r>
-        <w:t>: An Interactive Social Engineering Awareness Training Platform</w:t>
+      <w:r>
+        <w:t>CyberAware: An Interactive Social Engineering Awareness Training Platform</w:t>
       </w:r>
     </w:p>
     <w:p/>
@@ -46,23 +41,13 @@
       </w:r>
     </w:p>
     <w:p>
-      <w:proofErr w:type="spellStart"/>
-      <w:r>
-        <w:t>Anzol</w:t>
-      </w:r>
-      <w:proofErr w:type="spellEnd"/>
-      <w:r>
-        <w:t xml:space="preserve"> Neupane - S396740</w:t>
-      </w:r>
-    </w:p>
-    <w:p>
-      <w:proofErr w:type="spellStart"/>
-      <w:r>
-        <w:t>Manjil</w:t>
-      </w:r>
-      <w:proofErr w:type="spellEnd"/>
-      <w:r>
-        <w:t xml:space="preserve"> Sahani Chhetri - S393520</w:t>
+      <w:r>
+        <w:t>Anzol Neupane - S396740</w:t>
+      </w:r>
+    </w:p>
+    <w:p>
+      <w:r>
+        <w:t>Manjil Sahani Chhetri - S393520</w:t>
       </w:r>
     </w:p>
     <w:p/>
@@ -109,21 +94,8 @@
     </w:p>
     <w:p/>
     <w:p>
-      <w:proofErr w:type="spellStart"/>
-      <w:r>
-        <w:t>CyberAware</w:t>
-      </w:r>
-      <w:proofErr w:type="spellEnd"/>
-      <w:r>
-        <w:t xml:space="preserve"> is a web-based Social Engineering Awareness Training Platform designed to help users recognise, understand, and respond to common social engineering attacks. Social engineering attacks such as phishing emails, fake login pages, suspicious links, SMS scams, impersonation attempts, and pretexting are common security threats because they target human behaviour rather than only technical weaknesses. The purpose of </w:t>
-      </w:r>
-      <w:proofErr w:type="spellStart"/>
-      <w:r>
-        <w:t>CyberAware</w:t>
-      </w:r>
-      <w:proofErr w:type="spellEnd"/>
-      <w:r>
-        <w:t xml:space="preserve"> is to provide an interactive learning environment where learners can complete awareness modules, attempt realistic simulation scenarios, receive immediate feedback, and track their improvement over time.</w:t>
+      <w:r>
+        <w:t>CyberAware is a web-based Social Engineering Awareness Training Platform designed to help users recognise, understand, and respond to common social engineering attacks. Social engineering attacks such as phishing emails, fake login pages, suspicious links, SMS scams, impersonation attempts, and pretexting are common security threats because they target human behaviour rather than only technical weaknesses. The purpose of CyberAware is to provide an interactive learning environment where learners can complete awareness modules, attempt realistic simulation scenarios, receive immediate feedback, and track their improvement over time.</w:t>
       </w:r>
     </w:p>
     <w:p/>
@@ -153,13 +125,8 @@
     </w:p>
     <w:p/>
     <w:p>
-      <w:proofErr w:type="spellStart"/>
-      <w:r>
-        <w:t>CyberAware</w:t>
-      </w:r>
-      <w:proofErr w:type="spellEnd"/>
-      <w:r>
-        <w:t xml:space="preserve"> has been designed with ethical software engineering principles in mind. Since the platform deals with cybersecurity awareness, simulated social engineering attacks, user performance records, and training feedback, the system must be developed in a way that protects users, avoids misuse, and supports responsible learning.</w:t>
+      <w:r>
+        <w:t>CyberAware has been designed with ethical software engineering principles in mind. Since the platform deals with cybersecurity awareness, simulated social engineering attacks, user performance records, and training feedback, the system must be developed in a way that protects users, avoids misuse, and supports responsible learning.</w:t>
       </w:r>
     </w:p>
     <w:p/>
@@ -171,15 +138,7 @@
     <w:p/>
     <w:p>
       <w:r>
-        <w:t xml:space="preserve">User privacy is also an important ethical concern. </w:t>
-      </w:r>
-      <w:proofErr w:type="spellStart"/>
-      <w:r>
-        <w:t>CyberAware</w:t>
-      </w:r>
-      <w:proofErr w:type="spellEnd"/>
-      <w:r>
-        <w:t xml:space="preserve"> may store learner names, email addresses, training progress, quiz scores, scenario attempts, and feedback records. This information should only be accessible to authorised users such as the learner, trainer, or administrator. The system should apply authentication, role-based access control, input validation, secure session handling, and data minimisation to reduce privacy and security risks.</w:t>
+        <w:t>User privacy is also an important ethical concern. CyberAware may store learner names, email addresses, training progress, quiz scores, scenario attempts, and feedback records. This information should only be accessible to authorised users such as the learner, trainer, or administrator. The system should apply authentication, role-based access control, input validation, secure session handling, and data minimisation to reduce privacy and security risks.</w:t>
       </w:r>
     </w:p>
     <w:p/>
@@ -198,15 +157,7 @@
     <w:p>
       <w:r>
         <w:lastRenderedPageBreak/>
-        <w:t xml:space="preserve">Overall, </w:t>
-      </w:r>
-      <w:proofErr w:type="spellStart"/>
-      <w:r>
-        <w:t>CyberAware</w:t>
-      </w:r>
-      <w:proofErr w:type="spellEnd"/>
-      <w:r>
-        <w:t xml:space="preserve"> supports public interest by helping users become more aware of social engineering threats. The system aims to reduce the risk of data breaches, identity theft, credential compromise, and unsafe online behaviour through ethical, educational, and user-centred software design.</w:t>
+        <w:t>Overall, CyberAware supports public interest by helping users become more aware of social engineering threats. The system aims to reduce the risk of data breaches, identity theft, credential compromise, and unsafe online behaviour through ethical, educational, and user-centred software design.</w:t>
       </w:r>
     </w:p>
     <w:p/>
@@ -223,13 +174,8 @@
     </w:p>
     <w:p/>
     <w:p>
-      <w:proofErr w:type="spellStart"/>
-      <w:r>
-        <w:t>CyberAware</w:t>
-      </w:r>
-      <w:proofErr w:type="spellEnd"/>
-      <w:r>
-        <w:t xml:space="preserve"> is an interactive web-based Social Engineering Awareness Training Platform designed to help learners recognise and respond to common social engineering attacks. The project is based on the official Social Engineering Awareness Training project area, which focuses on teaching users how to identify and avoid attacks such as phishing, pretexting, impersonation, and other manipulation-based cyber threats.</w:t>
+      <w:r>
+        <w:t>CyberAware is an interactive web-based Social Engineering Awareness Training Platform designed to help learners recognise and respond to common social engineering attacks. The project is based on the official Social Engineering Awareness Training project area, which focuses on teaching users how to identify and avoid attacks such as phishing, pretexting, impersonation, and other manipulation-based cyber threats.</w:t>
       </w:r>
     </w:p>
     <w:p/>
@@ -240,13 +186,8 @@
     </w:p>
     <w:p/>
     <w:p>
-      <w:proofErr w:type="spellStart"/>
-      <w:r>
-        <w:t>CyberAware</w:t>
-      </w:r>
-      <w:proofErr w:type="spellEnd"/>
-      <w:r>
-        <w:t xml:space="preserve"> provides a safe digital learning environment where users can practise identifying suspicious messages and behaviours before facing real attacks. The system includes awareness modules, simulated phishing and social engineering scenarios, quizzes, instant feedback, learner progress tracking, administrator scenario management, and reporting dashboards. The platform is designed for learners, trainers, administrators, and system maintainers.</w:t>
+      <w:r>
+        <w:t>CyberAware provides a safe digital learning environment where users can practise identifying suspicious messages and behaviours before facing real attacks. The system includes awareness modules, simulated phishing and social engineering scenarios, quizzes, instant feedback, learner progress tracking, administrator scenario management, and reporting dashboards. The platform is designed for learners, trainers, administrators, and system maintainers.</w:t>
       </w:r>
     </w:p>
     <w:p/>
@@ -268,15 +209,7 @@
     <w:p/>
     <w:p>
       <w:r>
-        <w:t xml:space="preserve">The purpose of </w:t>
-      </w:r>
-      <w:proofErr w:type="spellStart"/>
-      <w:r>
-        <w:t>CyberAware</w:t>
-      </w:r>
-      <w:proofErr w:type="spellEnd"/>
-      <w:r>
-        <w:t xml:space="preserve"> is to improve user awareness and response capability against social engineering attacks through interactive training and simulation. The platform allows learners to understand common attack patterns, practise decision-making in realistic scenarios, and receive immediate feedback about their choices.</w:t>
+        <w:t>The purpose of CyberAware is to improve user awareness and response capability against social engineering attacks through interactive training and simulation. The platform allows learners to understand common attack patterns, practise decision-making in realistic scenarios, and receive immediate feedback about their choices.</w:t>
       </w:r>
     </w:p>
     <w:p/>
@@ -287,13 +220,8 @@
     </w:p>
     <w:p/>
     <w:p>
-      <w:proofErr w:type="spellStart"/>
-      <w:r>
-        <w:t>CyberAware</w:t>
-      </w:r>
-      <w:proofErr w:type="spellEnd"/>
-      <w:r>
-        <w:t xml:space="preserve"> aims to reduce the likelihood of unsafe user behaviour such as clicking suspicious links, entering credentials into fake pages, trusting impersonation messages, or sharing sensitive information without verification.</w:t>
+      <w:r>
+        <w:t>CyberAware aims to reduce the likelihood of unsafe user behaviour such as clicking suspicious links, entering credentials into fake pages, trusting impersonation messages, or sharing sensitive information without verification.</w:t>
       </w:r>
     </w:p>
     <w:p/>
@@ -305,15 +233,7 @@
     <w:p/>
     <w:p>
       <w:r>
-        <w:t xml:space="preserve">The main objectives of the </w:t>
-      </w:r>
-      <w:proofErr w:type="spellStart"/>
-      <w:r>
-        <w:t>CyberAware</w:t>
-      </w:r>
-      <w:proofErr w:type="spellEnd"/>
-      <w:r>
-        <w:t xml:space="preserve"> project are:</w:t>
+        <w:t>The main objectives of the CyberAware project are:</w:t>
       </w:r>
     </w:p>
     <w:p/>
@@ -382,15 +302,7 @@
     <w:p/>
     <w:p>
       <w:r>
-        <w:t xml:space="preserve">The </w:t>
-      </w:r>
-      <w:proofErr w:type="spellStart"/>
-      <w:r>
-        <w:t>CyberAware</w:t>
-      </w:r>
-      <w:proofErr w:type="spellEnd"/>
-      <w:r>
-        <w:t xml:space="preserve"> project deliverables are divided into software prototype deliverables, design deliverables, testing deliverables, and documentation deliverables.</w:t>
+        <w:t>The CyberAware project deliverables are divided into software prototype deliverables, design deliverables, testing deliverables, and documentation deliverables.</w:t>
       </w:r>
     </w:p>
     <w:p/>
@@ -412,15 +324,7 @@
     </w:p>
     <w:p>
       <w:r>
-        <w:t xml:space="preserve">• A landing page introducing the </w:t>
-      </w:r>
-      <w:proofErr w:type="spellStart"/>
-      <w:r>
-        <w:t>CyberAware</w:t>
-      </w:r>
-      <w:proofErr w:type="spellEnd"/>
-      <w:r>
-        <w:t xml:space="preserve"> platform.</w:t>
+        <w:t>• A landing page introducing the CyberAware platform.</w:t>
       </w:r>
     </w:p>
     <w:p>
@@ -435,15 +339,7 @@
     </w:p>
     <w:p>
       <w:r>
-        <w:t xml:space="preserve">• A training module page listing available awareness </w:t>
-      </w:r>
-      <w:proofErr w:type="gramStart"/>
-      <w:r>
-        <w:t>topics</w:t>
-      </w:r>
-      <w:proofErr w:type="gramEnd"/>
-      <w:r>
-        <w:t>.</w:t>
+        <w:t>• A training module page listing available awareness topics.</w:t>
       </w:r>
     </w:p>
     <w:p>
@@ -632,29 +528,13 @@
     <w:p/>
     <w:p>
       <w:r>
-        <w:t xml:space="preserve">A feasibility study was conducted to evaluate whether </w:t>
-      </w:r>
-      <w:proofErr w:type="spellStart"/>
-      <w:r>
-        <w:t>CyberAware</w:t>
-      </w:r>
-      <w:proofErr w:type="spellEnd"/>
-      <w:r>
-        <w:t xml:space="preserve"> is practical and suitable for development as an academic software engineering project. The feasibility analysis considers technical feasibility, financial feasibility, operational feasibility, and schedule feasibility.</w:t>
-      </w:r>
-    </w:p>
-    <w:p/>
-    <w:p>
-      <w:r>
-        <w:t xml:space="preserve">The proposed system is feasible because it can be developed using widely available web technologies and free or low-cost tools. The prototype can be created using HTML, CSS, JavaScript, Visual Studio Code, GitHub, and GitHub Pages. Diagrams can be created using Draw.io or </w:t>
-      </w:r>
-      <w:proofErr w:type="spellStart"/>
-      <w:r>
-        <w:t>Lucidchart</w:t>
-      </w:r>
-      <w:proofErr w:type="spellEnd"/>
-      <w:r>
-        <w:t>, while documentation can be prepared using Microsoft Word. These tools are accessible to the project team and suitable for an academic project.</w:t>
+        <w:t>A feasibility study was conducted to evaluate whether CyberAware is practical and suitable for development as an academic software engineering project. The feasibility analysis considers technical feasibility, financial feasibility, operational feasibility, and schedule feasibility.</w:t>
+      </w:r>
+    </w:p>
+    <w:p/>
+    <w:p>
+      <w:r>
+        <w:t>The proposed system is feasible because it can be developed using widely available web technologies and free or low-cost tools. The prototype can be created using HTML, CSS, JavaScript, Visual Studio Code, GitHub, and GitHub Pages. Diagrams can be created using Draw.io or Lucidchart, while documentation can be prepared using Microsoft Word. These tools are accessible to the project team and suitable for an academic project.</w:t>
       </w:r>
     </w:p>
     <w:p/>
@@ -671,13 +551,8 @@
     </w:p>
     <w:p/>
     <w:p>
-      <w:proofErr w:type="spellStart"/>
-      <w:r>
-        <w:t>CyberAware</w:t>
-      </w:r>
-      <w:proofErr w:type="spellEnd"/>
-      <w:r>
-        <w:t xml:space="preserve"> is technically feasible because the required technologies are common, stable, and suitable for web-based prototype development. The frontend prototype can be built using HTML, CSS, and JavaScript. GitHub Pages can host the static digital </w:t>
+      <w:r>
+        <w:t xml:space="preserve">CyberAware is technically feasible because the required technologies are common, stable, and suitable for web-based prototype development. The frontend prototype can be built using HTML, CSS, and JavaScript. GitHub Pages can host the static digital </w:t>
       </w:r>
       <w:r>
         <w:lastRenderedPageBreak/>
@@ -741,13 +616,8 @@
     </w:p>
     <w:p/>
     <w:p>
-      <w:proofErr w:type="spellStart"/>
-      <w:r>
-        <w:t>CyberAware</w:t>
-      </w:r>
-      <w:proofErr w:type="spellEnd"/>
-      <w:r>
-        <w:t xml:space="preserve"> is financially feasible because the prototype can be developed using free or low-cost tools. The project does not require paid hosting, paid database services, commercial design tools, or specialised hardware. GitHub Pages provides free static website hosting, and GitHub provides free repository management for the project.</w:t>
+      <w:r>
+        <w:t>CyberAware is financially feasible because the prototype can be developed using free or low-cost tools. The project does not require paid hosting, paid database services, commercial design tools, or specialised hardware. GitHub Pages provides free static website hosting, and GitHub provides free repository management for the project.</w:t>
       </w:r>
     </w:p>
     <w:p/>
@@ -905,13 +775,8 @@
     </w:p>
     <w:p/>
     <w:p>
-      <w:proofErr w:type="spellStart"/>
-      <w:r>
-        <w:t>CyberAware</w:t>
-      </w:r>
-      <w:proofErr w:type="spellEnd"/>
-      <w:r>
-        <w:t xml:space="preserve"> is operationally feasible because the system is easy to understand and useful for its target users. Learners only need basic browser skills to use the platform. They can log in, select a module, attempt scenarios, answer questions, and read feedback. Administrators can manage content and view progress reports through dashboard-style screens.</w:t>
+      <w:r>
+        <w:t>CyberAware is operationally feasible because the system is easy to understand and useful for its target users. Learners only need basic browser skills to use the platform. They can log in, select a module, attempt scenarios, answer questions, and read feedback. Administrators can manage content and view progress reports through dashboard-style screens.</w:t>
       </w:r>
     </w:p>
     <w:p/>
@@ -947,15 +812,7 @@
     <w:p/>
     <w:p>
       <w:r>
-        <w:t xml:space="preserve">The scope of </w:t>
-      </w:r>
-      <w:proofErr w:type="spellStart"/>
-      <w:r>
-        <w:t>CyberAware</w:t>
-      </w:r>
-      <w:proofErr w:type="spellEnd"/>
-      <w:r>
-        <w:t xml:space="preserve"> includes the design, documentation, prototype development, and testing plan for a web-based Social Engineering Awareness Training Platform. The system focuses on educating learners about common social engineering threats and providing a safe environment where users can practise recognising suspicious communication before facing real attacks.</w:t>
+        <w:t>The scope of CyberAware includes the design, documentation, prototype development, and testing plan for a web-based Social Engineering Awareness Training Platform. The system focuses on educating learners about common social engineering threats and providing a safe environment where users can practise recognising suspicious communication before facing real attacks.</w:t>
       </w:r>
     </w:p>
     <w:p/>
@@ -967,15 +824,7 @@
     <w:p/>
     <w:p>
       <w:r>
-        <w:t xml:space="preserve">The system is designed as an academic software engineering project and digital prototype. Therefore, the </w:t>
-      </w:r>
-      <w:proofErr w:type="gramStart"/>
-      <w:r>
-        <w:t>main focus</w:t>
-      </w:r>
-      <w:proofErr w:type="gramEnd"/>
-      <w:r>
-        <w:t xml:space="preserve"> is not to build a full enterprise production system, but to demonstrate a complete software engineering process. This includes requirements analysis, feasibility study, Agile planning, use case identification, requirement prioritisation, software architecture, UML modelling, design patterns, test planning, security analysis, deployment planning, and prototype demonstration.</w:t>
+        <w:t>The system is designed as an academic software engineering project and digital prototype. Therefore, the main focus is not to build a full enterprise production system, but to demonstrate a complete software engineering process. This includes requirements analysis, feasibility study, Agile planning, use case identification, requirement prioritisation, software architecture, UML modelling, design patterns, test planning, security analysis, deployment planning, and prototype demonstration.</w:t>
       </w:r>
     </w:p>
     <w:p/>
@@ -1060,13 +909,8 @@
     </w:p>
     <w:p/>
     <w:p>
-      <w:proofErr w:type="spellStart"/>
-      <w:r>
-        <w:t>CyberAware</w:t>
-      </w:r>
-      <w:proofErr w:type="spellEnd"/>
-      <w:r>
-        <w:t xml:space="preserve"> provides several benefits for learners, trainers, and organisations.</w:t>
+      <w:r>
+        <w:t>CyberAware provides several benefits for learners, trainers, and organisations.</w:t>
       </w:r>
     </w:p>
     <w:p/>
@@ -1085,15 +929,7 @@
     <w:p>
       <w:r>
         <w:lastRenderedPageBreak/>
-        <w:t xml:space="preserve">Third, </w:t>
-      </w:r>
-      <w:proofErr w:type="spellStart"/>
-      <w:r>
-        <w:t>CyberAware</w:t>
-      </w:r>
-      <w:proofErr w:type="spellEnd"/>
-      <w:r>
-        <w:t xml:space="preserve"> supports progress tracking. Learners can view their training completion, quiz score, scenario performance, and improvement areas. Trainers and administrators can use reports to identify users who may need additional support.</w:t>
+        <w:t>Third, CyberAware supports progress tracking. Learners can view their training completion, quiz score, scenario performance, and improvement areas. Trainers and administrators can use reports to identify users who may need additional support.</w:t>
       </w:r>
     </w:p>
     <w:p/>
@@ -1105,15 +941,7 @@
     <w:p/>
     <w:p>
       <w:r>
-        <w:t xml:space="preserve">Fifth, the system supports safer organisational behaviour. By training users to recognise phishing, fake login attempts, impersonation, and suspicious requests, </w:t>
-      </w:r>
-      <w:proofErr w:type="spellStart"/>
-      <w:r>
-        <w:t>CyberAware</w:t>
-      </w:r>
-      <w:proofErr w:type="spellEnd"/>
-      <w:r>
-        <w:t xml:space="preserve"> can reduce the risk of credential theft, data leakage, malware infection, and unauthorised access.</w:t>
+        <w:t>Fifth, the system supports safer organisational behaviour. By training users to recognise phishing, fake login attempts, impersonation, and suspicious requests, CyberAware can reduce the risk of credential theft, data leakage, malware infection, and unauthorised access.</w:t>
       </w:r>
     </w:p>
     <w:p/>
@@ -1131,15 +959,7 @@
     <w:p/>
     <w:p>
       <w:r>
-        <w:t xml:space="preserve">Although </w:t>
-      </w:r>
-      <w:proofErr w:type="spellStart"/>
-      <w:r>
-        <w:t>CyberAware</w:t>
-      </w:r>
-      <w:proofErr w:type="spellEnd"/>
-      <w:r>
-        <w:t xml:space="preserve"> provides useful training and awareness features, the project has some limitations.</w:t>
+        <w:t>Although CyberAware provides useful training and awareness features, the project has some limitations.</w:t>
       </w:r>
     </w:p>
     <w:p/>
@@ -1186,32 +1006,14 @@
     </w:p>
     <w:p/>
     <w:p>
-      <w:proofErr w:type="spellStart"/>
-      <w:r>
-        <w:t>CyberAware</w:t>
-      </w:r>
-      <w:proofErr w:type="spellEnd"/>
-      <w:r>
-        <w:t xml:space="preserve"> is similar in purpose to commercial cybersecurity awareness platforms such as KnowBe4, Proofpoint Security Awareness, and </w:t>
-      </w:r>
-      <w:proofErr w:type="spellStart"/>
-      <w:r>
-        <w:t>Cofense</w:t>
-      </w:r>
-      <w:proofErr w:type="spellEnd"/>
-      <w:r>
-        <w:t>. These systems provide phishing simulations, awareness training, reporting, and organisational risk reduction. However, those platforms are enterprise-level products that may require paid subscriptions and advanced administrative setup.</w:t>
-      </w:r>
-    </w:p>
-    <w:p/>
-    <w:p>
-      <w:proofErr w:type="spellStart"/>
-      <w:r>
-        <w:t>CyberAware</w:t>
-      </w:r>
-      <w:proofErr w:type="spellEnd"/>
-      <w:r>
-        <w:t xml:space="preserve"> is designed as an academic prototype that focuses on simplicity, learning, and software engineering demonstration. Its strength is that it clearly shows the core workflow of awareness training, simulation, feedback, scoring, and reporting in a lightweight web-based interface. It is not intended to compete directly with large commercial platforms, but to demonstrate how a similar concept can be designed using software engineering principles.</w:t>
+      <w:r>
+        <w:t>CyberAware is similar in purpose to commercial cybersecurity awareness platforms such as KnowBe4, Proofpoint Security Awareness, and Cofense. These systems provide phishing simulations, awareness training, reporting, and organisational risk reduction. However, those platforms are enterprise-level products that may require paid subscriptions and advanced administrative setup.</w:t>
+      </w:r>
+    </w:p>
+    <w:p/>
+    <w:p>
+      <w:r>
+        <w:t>CyberAware is designed as an academic prototype that focuses on simplicity, learning, and software engineering demonstration. Its strength is that it clearly shows the core workflow of awareness training, simulation, feedback, scoring, and reporting in a lightweight web-based interface. It is not intended to compete directly with large commercial platforms, but to demonstrate how a similar concept can be designed using software engineering principles.</w:t>
       </w:r>
     </w:p>
     <w:p/>
@@ -1288,15 +1090,7 @@
     </w:p>
     <w:p>
       <w:r>
-        <w:t xml:space="preserve">Member: </w:t>
-      </w:r>
-      <w:proofErr w:type="spellStart"/>
-      <w:r>
-        <w:t>Anzol</w:t>
-      </w:r>
-      <w:proofErr w:type="spellEnd"/>
-      <w:r>
-        <w:t xml:space="preserve"> Neupane</w:t>
+        <w:t>Member: Anzol Neupane</w:t>
       </w:r>
     </w:p>
     <w:p>
@@ -1312,15 +1106,7 @@
     </w:p>
     <w:p>
       <w:r>
-        <w:t xml:space="preserve">Member: </w:t>
-      </w:r>
-      <w:proofErr w:type="spellStart"/>
-      <w:r>
-        <w:t>Manjil</w:t>
-      </w:r>
-      <w:proofErr w:type="spellEnd"/>
-      <w:r>
-        <w:t xml:space="preserve"> Sahani Chhetri</w:t>
+        <w:t>Member: Manjil Sahani Chhetri</w:t>
       </w:r>
     </w:p>
     <w:p>
@@ -1366,15 +1152,7 @@
     <w:p/>
     <w:p>
       <w:r>
-        <w:t xml:space="preserve">GitHub Pages is used to publish the </w:t>
-      </w:r>
-      <w:proofErr w:type="spellStart"/>
-      <w:r>
-        <w:t>CyberAware</w:t>
-      </w:r>
-      <w:proofErr w:type="spellEnd"/>
-      <w:r>
-        <w:t xml:space="preserve"> digital prototype as a public web link. This satisfies the requirement for a working digital user interface demo.</w:t>
+        <w:t>GitHub Pages is used to publish the CyberAware digital prototype as a public web link. This satisfies the requirement for a working digital user interface demo.</w:t>
       </w:r>
     </w:p>
     <w:p/>
@@ -1392,15 +1170,7 @@
     <w:p/>
     <w:p>
       <w:r>
-        <w:t xml:space="preserve">Draw.io or </w:t>
-      </w:r>
-      <w:proofErr w:type="spellStart"/>
-      <w:r>
-        <w:t>Lucidchart</w:t>
-      </w:r>
-      <w:proofErr w:type="spellEnd"/>
-      <w:r>
-        <w:t xml:space="preserve"> is used to create UML diagrams such as use case diagram, sequence diagram, class diagram, ER diagram, activity diagram, and architecture diagram.</w:t>
+        <w:t>Draw.io or Lucidchart is used to create UML diagrams such as use case diagram, sequence diagram, class diagram, ER diagram, activity diagram, and architecture diagram.</w:t>
       </w:r>
     </w:p>
     <w:p/>
@@ -1431,15 +1201,2876 @@
     <w:p/>
     <w:p>
       <w:r>
-        <w:t xml:space="preserve">The main techniques used in the project include Agile-incremental development, Scrum-style task planning, user stories, </w:t>
-      </w:r>
-      <w:proofErr w:type="spellStart"/>
-      <w:r>
-        <w:t>MoSCoW</w:t>
-      </w:r>
-      <w:proofErr w:type="spellEnd"/>
-      <w:r>
-        <w:t xml:space="preserve"> prioritisation, requirement traceability, UML modelling, MVC design pattern, three-tier architecture, requirement-based testing, and security risk analysis.</w:t>
+        <w:t>The main techniques used in the project include Agile-incremental development, Scrum-style task planning, user stories, MoSCoW prioritisation, requirement traceability, UML modelling, MVC design pattern, three-tier architecture, requirement-based testing, and security risk analysis.</w:t>
+      </w:r>
+    </w:p>
+    <w:p/>
+    <w:p>
+      <w:r>
+        <w:t>3. Software Requirements</w:t>
+      </w:r>
+    </w:p>
+    <w:p/>
+    <w:p>
+      <w:r>
+        <w:t>The Software Requirements section defines what the CyberAware system must do and the quality conditions it must satisfy. The requirements were identified by analysing the needs of learners, trainers, administrators, and system maintainers. The requirements are organised into use cases, user stories, functional requirements, non-functional requirements, milestones, risks, operating environment, assumptions, dependencies, and requirement traceability.</w:t>
+      </w:r>
+    </w:p>
+    <w:p/>
+    <w:p>
+      <w:r>
+        <w:t>CyberAware is designed as a web-based social engineering awareness training platform. Therefore, the system requirements focus on training access, simulation scenarios, learner assessment, feedback, progress tracking, administrator management, reporting, security, usability, maintainability, and future scalability.</w:t>
+      </w:r>
+    </w:p>
+    <w:p/>
+    <w:p>
+      <w:r>
+        <w:t>The requirements were written using clear requirement language. Mandatory requirements use the word “shall”, while desirable or future requirements use the word “should”. Requirements are also prioritised using the following priority scale:</w:t>
+      </w:r>
+    </w:p>
+    <w:p/>
+    <w:p>
+      <w:r>
+        <w:lastRenderedPageBreak/>
+        <w:t>Priority 1: Critical</w:t>
+      </w:r>
+    </w:p>
+    <w:p>
+      <w:r>
+        <w:t>Priority 2: High</w:t>
+      </w:r>
+    </w:p>
+    <w:p>
+      <w:r>
+        <w:t>Priority 3: Medium</w:t>
+      </w:r>
+    </w:p>
+    <w:p>
+      <w:r>
+        <w:t>Priority 4: Low</w:t>
+      </w:r>
+    </w:p>
+    <w:p>
+      <w:r>
+        <w:t>Priority 5: Future Enhancement</w:t>
+      </w:r>
+    </w:p>
+    <w:p/>
+    <w:p>
+      <w:r>
+        <w:t>3.1 Product Use Cases</w:t>
+      </w:r>
+    </w:p>
+    <w:p/>
+    <w:p>
+      <w:r>
+        <w:t>The CyberAware system has four main user groups:</w:t>
+      </w:r>
+    </w:p>
+    <w:p/>
+    <w:p>
+      <w:r>
+        <w:t>1. Learner</w:t>
+      </w:r>
+    </w:p>
+    <w:p>
+      <w:r>
+        <w:t>2. Trainer / Lecturer</w:t>
+      </w:r>
+    </w:p>
+    <w:p>
+      <w:r>
+        <w:t>3. Administrator</w:t>
+      </w:r>
+    </w:p>
+    <w:p>
+      <w:r>
+        <w:t>4. System Maintainer</w:t>
+      </w:r>
+    </w:p>
+    <w:p/>
+    <w:p>
+      <w:r>
+        <w:t>The Learner uses the system to complete awareness training, attempt simulations, answer quizzes, receive feedback, and track progress. The Trainer or Lecturer uses the system to review learner performance and identify users who need additional support. The Administrator manages users, modules, scenarios, and reports. The System Maintainer manages technical configuration, deployment, backup planning, and security monitoring.</w:t>
+      </w:r>
+    </w:p>
+    <w:p/>
+    <w:p>
+      <w:r>
+        <w:t>3.1.1 Use Case Diagram</w:t>
+      </w:r>
+    </w:p>
+    <w:p/>
+    <w:p>
+      <w:r>
+        <w:t>[Insert Figure 1 here: CyberAware Use Case Diagram]</w:t>
+      </w:r>
+    </w:p>
+    <w:p/>
+    <w:p>
+      <w:r>
+        <w:t xml:space="preserve">The use case diagram shows how the main actors interact with the CyberAware platform. The Learner interacts with functions such as register, log in, view modules, attempt simulation, complete quiz, view feedback, and view progress. The Administrator manages modules, scenarios, users, and reports. The Trainer reviews </w:t>
+      </w:r>
+      <w:r>
+        <w:lastRenderedPageBreak/>
+        <w:t>learner results and identifies high-risk responses. The System Maintainer manages technical settings, backup planning, and deployment support.</w:t>
+      </w:r>
+    </w:p>
+    <w:p/>
+    <w:p>
+      <w:r>
+        <w:t>Use Case Diagram Actors:</w:t>
+      </w:r>
+    </w:p>
+    <w:p/>
+    <w:p>
+      <w:r>
+        <w:t>• Learner</w:t>
+      </w:r>
+    </w:p>
+    <w:p>
+      <w:r>
+        <w:t>• Trainer / Lecturer</w:t>
+      </w:r>
+    </w:p>
+    <w:p>
+      <w:r>
+        <w:t>• Administrator</w:t>
+      </w:r>
+    </w:p>
+    <w:p>
+      <w:r>
+        <w:t>• System Maintainer</w:t>
+      </w:r>
+    </w:p>
+    <w:p/>
+    <w:p>
+      <w:r>
+        <w:t>Main Use Cases:</w:t>
+      </w:r>
+    </w:p>
+    <w:p/>
+    <w:p>
+      <w:r>
+        <w:t>• Register Account</w:t>
+      </w:r>
+    </w:p>
+    <w:p>
+      <w:r>
+        <w:t>• Log In</w:t>
+      </w:r>
+    </w:p>
+    <w:p>
+      <w:r>
+        <w:t>• View Training Modules</w:t>
+      </w:r>
+    </w:p>
+    <w:p>
+      <w:r>
+        <w:t>• Complete Awareness Module</w:t>
+      </w:r>
+    </w:p>
+    <w:p>
+      <w:r>
+        <w:t>• Attempt Social Engineering Simulation</w:t>
+      </w:r>
+    </w:p>
+    <w:p>
+      <w:r>
+        <w:t>• Submit Quiz Response</w:t>
+      </w:r>
+    </w:p>
+    <w:p>
+      <w:r>
+        <w:t>• View Immediate Feedback</w:t>
+      </w:r>
+    </w:p>
+    <w:p>
+      <w:r>
+        <w:t>• View Progress Report</w:t>
+      </w:r>
+    </w:p>
+    <w:p>
+      <w:r>
+        <w:t>• Manage Training Modules</w:t>
+      </w:r>
+    </w:p>
+    <w:p>
+      <w:r>
+        <w:t>• Manage Simulation Scenarios</w:t>
+      </w:r>
+    </w:p>
+    <w:p>
+      <w:r>
+        <w:t>• Manage Users</w:t>
+      </w:r>
+    </w:p>
+    <w:p>
+      <w:r>
+        <w:t>• View Learner Reports</w:t>
+      </w:r>
+    </w:p>
+    <w:p>
+      <w:r>
+        <w:t>• Identify High-Risk Responses</w:t>
+      </w:r>
+    </w:p>
+    <w:p>
+      <w:r>
+        <w:t>• Manage System Configuration</w:t>
+      </w:r>
+    </w:p>
+    <w:p>
+      <w:r>
+        <w:t>• Monitor Deployment</w:t>
+      </w:r>
+    </w:p>
+    <w:p/>
+    <w:p>
+      <w:r>
+        <w:lastRenderedPageBreak/>
+        <w:t>3.1.2 Product Use Case List</w:t>
+      </w:r>
+    </w:p>
+    <w:p/>
+    <w:p>
+      <w:r>
+        <w:t>Table: Product Use Cases</w:t>
+      </w:r>
+    </w:p>
+    <w:p/>
+    <w:p>
+      <w:r>
+        <w:t>Use Case ID: UC-01</w:t>
+      </w:r>
+    </w:p>
+    <w:p>
+      <w:r>
+        <w:t>Use Case Name: Register Account</w:t>
+      </w:r>
+    </w:p>
+    <w:p>
+      <w:r>
+        <w:t>Actor: Learner</w:t>
+      </w:r>
+    </w:p>
+    <w:p>
+      <w:r>
+        <w:t>Description: The learner creates an account to access training modules and save progress.</w:t>
+      </w:r>
+    </w:p>
+    <w:p/>
+    <w:p>
+      <w:r>
+        <w:t>Use Case ID: UC-02</w:t>
+      </w:r>
+    </w:p>
+    <w:p>
+      <w:r>
+        <w:t>Use Case Name: Log In</w:t>
+      </w:r>
+    </w:p>
+    <w:p>
+      <w:r>
+        <w:t>Actor: Learner, Trainer, Administrator</w:t>
+      </w:r>
+    </w:p>
+    <w:p>
+      <w:r>
+        <w:t>Description: The user logs into the system using valid credentials and is redirected based on role.</w:t>
+      </w:r>
+    </w:p>
+    <w:p/>
+    <w:p>
+      <w:r>
+        <w:t>Use Case ID: UC-03</w:t>
+      </w:r>
+    </w:p>
+    <w:p>
+      <w:r>
+        <w:t>Use Case Name: View Training Modules</w:t>
+      </w:r>
+    </w:p>
+    <w:p>
+      <w:r>
+        <w:t>Actor: Learner</w:t>
+      </w:r>
+    </w:p>
+    <w:p>
+      <w:r>
+        <w:t>Description: The learner views available awareness modules such as phishing, pretexting, fake login pages, SMS scams, and suspicious links.</w:t>
+      </w:r>
+    </w:p>
+    <w:p/>
+    <w:p>
+      <w:r>
+        <w:t>Use Case ID: UC-04</w:t>
+      </w:r>
+    </w:p>
+    <w:p>
+      <w:r>
+        <w:t>Use Case Name: Complete Awareness Module</w:t>
+      </w:r>
+    </w:p>
+    <w:p>
+      <w:r>
+        <w:t>Actor: Learner</w:t>
+      </w:r>
+    </w:p>
+    <w:p>
+      <w:r>
+        <w:t>Description: The learner reads or views training content and completes module activities.</w:t>
+      </w:r>
+    </w:p>
+    <w:p/>
+    <w:p>
+      <w:r>
+        <w:t>Use Case ID: UC-05</w:t>
+      </w:r>
+    </w:p>
+    <w:p>
+      <w:r>
+        <w:lastRenderedPageBreak/>
+        <w:t>Use Case Name: Attempt Simulation</w:t>
+      </w:r>
+    </w:p>
+    <w:p>
+      <w:r>
+        <w:t>Actor: Learner</w:t>
+      </w:r>
+    </w:p>
+    <w:p>
+      <w:r>
+        <w:t>Description: The learner attempts a simulated social engineering scenario and selects a safe or risky response.</w:t>
+      </w:r>
+    </w:p>
+    <w:p/>
+    <w:p>
+      <w:r>
+        <w:t>Use Case ID: UC-06</w:t>
+      </w:r>
+    </w:p>
+    <w:p>
+      <w:r>
+        <w:t>Use Case Name: Submit Quiz Response</w:t>
+      </w:r>
+    </w:p>
+    <w:p>
+      <w:r>
+        <w:t>Actor: Learner</w:t>
+      </w:r>
+    </w:p>
+    <w:p>
+      <w:r>
+        <w:t>Description: The learner answers quiz questions connected to the training or simulation scenario.</w:t>
+      </w:r>
+    </w:p>
+    <w:p/>
+    <w:p>
+      <w:r>
+        <w:t>Use Case ID: UC-07</w:t>
+      </w:r>
+    </w:p>
+    <w:p>
+      <w:r>
+        <w:t>Use Case Name: View Feedback</w:t>
+      </w:r>
+    </w:p>
+    <w:p>
+      <w:r>
+        <w:t>Actor: Learner</w:t>
+      </w:r>
+    </w:p>
+    <w:p>
+      <w:r>
+        <w:t>Description: The system provides immediate feedback explaining why the learner’s answer was safe or risky.</w:t>
+      </w:r>
+    </w:p>
+    <w:p/>
+    <w:p>
+      <w:r>
+        <w:t>Use Case ID: UC-08</w:t>
+      </w:r>
+    </w:p>
+    <w:p>
+      <w:r>
+        <w:t>Use Case Name: View Progress</w:t>
+      </w:r>
+    </w:p>
+    <w:p>
+      <w:r>
+        <w:t>Actor: Learner</w:t>
+      </w:r>
+    </w:p>
+    <w:p>
+      <w:r>
+        <w:t>Description: The learner views module completion, scores, and improvement areas.</w:t>
+      </w:r>
+    </w:p>
+    <w:p/>
+    <w:p>
+      <w:r>
+        <w:t>Use Case ID: UC-09</w:t>
+      </w:r>
+    </w:p>
+    <w:p>
+      <w:r>
+        <w:t>Use Case Name: Manage Training Modules</w:t>
+      </w:r>
+    </w:p>
+    <w:p>
+      <w:r>
+        <w:t>Actor: Administrator</w:t>
+      </w:r>
+    </w:p>
+    <w:p>
+      <w:r>
+        <w:t>Description: The administrator creates, updates, or removes awareness modules.</w:t>
+      </w:r>
+    </w:p>
+    <w:p/>
+    <w:p>
+      <w:r>
+        <w:t>Use Case ID: UC-10</w:t>
+      </w:r>
+    </w:p>
+    <w:p>
+      <w:r>
+        <w:t>Use Case Name: Manage Simulation Scenarios</w:t>
+      </w:r>
+    </w:p>
+    <w:p>
+      <w:r>
+        <w:lastRenderedPageBreak/>
+        <w:t>Actor: Administrator</w:t>
+      </w:r>
+    </w:p>
+    <w:p>
+      <w:r>
+        <w:t>Description: The administrator adds or updates phishing, SMS scam, fake login, impersonation, and pretexting scenarios.</w:t>
+      </w:r>
+    </w:p>
+    <w:p/>
+    <w:p>
+      <w:r>
+        <w:t>Use Case ID: UC-11</w:t>
+      </w:r>
+    </w:p>
+    <w:p>
+      <w:r>
+        <w:t>Use Case Name: View Learner Reports</w:t>
+      </w:r>
+    </w:p>
+    <w:p>
+      <w:r>
+        <w:t>Actor: Trainer / Administrator</w:t>
+      </w:r>
+    </w:p>
+    <w:p>
+      <w:r>
+        <w:t>Description: The trainer or administrator reviews learner scores, module completion, and high-risk responses.</w:t>
+      </w:r>
+    </w:p>
+    <w:p/>
+    <w:p>
+      <w:r>
+        <w:t>Use Case ID: UC-12</w:t>
+      </w:r>
+    </w:p>
+    <w:p>
+      <w:r>
+        <w:t>Use Case Name: Manage Users</w:t>
+      </w:r>
+    </w:p>
+    <w:p>
+      <w:r>
+        <w:t>Actor: Administrator</w:t>
+      </w:r>
+    </w:p>
+    <w:p>
+      <w:r>
+        <w:t>Description: The administrator manages learner, trainer, and administrator accounts.</w:t>
+      </w:r>
+    </w:p>
+    <w:p/>
+    <w:p>
+      <w:r>
+        <w:t>Use Case ID: UC-13</w:t>
+      </w:r>
+    </w:p>
+    <w:p>
+      <w:r>
+        <w:t>Use Case Name: Monitor System Configuration</w:t>
+      </w:r>
+    </w:p>
+    <w:p>
+      <w:r>
+        <w:t>Actor: System Maintainer</w:t>
+      </w:r>
+    </w:p>
+    <w:p>
+      <w:r>
+        <w:t>Description: The system maintainer reviews deployment settings, backup planning, and technical configuration.</w:t>
+      </w:r>
+    </w:p>
+    <w:p/>
+    <w:p>
+      <w:r>
+        <w:t>3.1.3 User Stories</w:t>
+      </w:r>
+    </w:p>
+    <w:p/>
+    <w:p>
+      <w:r>
+        <w:t>User stories were prepared to support Agile planning and backlog creation. Each user story follows the format: “As a [type of user], I want [goal], so that [reason].”</w:t>
+      </w:r>
+    </w:p>
+    <w:p/>
+    <w:p>
+      <w:r>
+        <w:t>Table: User Stories</w:t>
+      </w:r>
+    </w:p>
+    <w:p/>
+    <w:p>
+      <w:r>
+        <w:t>User Story ID: US-01</w:t>
+      </w:r>
+    </w:p>
+    <w:p>
+      <w:r>
+        <w:lastRenderedPageBreak/>
+        <w:t>User Story: As a learner, I want to register and log in securely so that my training progress can be saved.</w:t>
+      </w:r>
+    </w:p>
+    <w:p>
+      <w:r>
+        <w:t>Priority: 1</w:t>
+      </w:r>
+    </w:p>
+    <w:p>
+      <w:r>
+        <w:t>Related Use Case: UC-01, UC-02</w:t>
+      </w:r>
+    </w:p>
+    <w:p/>
+    <w:p>
+      <w:r>
+        <w:t>User Story ID: US-02</w:t>
+      </w:r>
+    </w:p>
+    <w:p>
+      <w:r>
+        <w:t>User Story: As a learner, I want to view available training modules so that I can choose a topic to study.</w:t>
+      </w:r>
+    </w:p>
+    <w:p>
+      <w:r>
+        <w:t>Priority: 1</w:t>
+      </w:r>
+    </w:p>
+    <w:p>
+      <w:r>
+        <w:t>Related Use Case: UC-03</w:t>
+      </w:r>
+    </w:p>
+    <w:p/>
+    <w:p>
+      <w:r>
+        <w:t>User Story ID: US-03</w:t>
+      </w:r>
+    </w:p>
+    <w:p>
+      <w:r>
+        <w:t>User Story: As a learner, I want to complete phishing awareness modules so that I can understand common warning signs.</w:t>
+      </w:r>
+    </w:p>
+    <w:p>
+      <w:r>
+        <w:t>Priority: 1</w:t>
+      </w:r>
+    </w:p>
+    <w:p>
+      <w:r>
+        <w:t>Related Use Case: UC-04</w:t>
+      </w:r>
+    </w:p>
+    <w:p/>
+    <w:p>
+      <w:r>
+        <w:t>User Story ID: US-04</w:t>
+      </w:r>
+    </w:p>
+    <w:p>
+      <w:r>
+        <w:t>User Story: As a learner, I want to attempt simulated social engineering scenarios so that I can practise making safe decisions.</w:t>
+      </w:r>
+    </w:p>
+    <w:p>
+      <w:r>
+        <w:t>Priority: 1</w:t>
+      </w:r>
+    </w:p>
+    <w:p>
+      <w:r>
+        <w:t>Related Use Case: UC-05</w:t>
+      </w:r>
+    </w:p>
+    <w:p/>
+    <w:p>
+      <w:r>
+        <w:t>User Story ID: US-05</w:t>
+      </w:r>
+    </w:p>
+    <w:p>
+      <w:r>
+        <w:t>User Story: As a learner, I want to receive immediate feedback after each scenario so that I can understand my mistakes and improve.</w:t>
+      </w:r>
+    </w:p>
+    <w:p>
+      <w:r>
+        <w:t>Priority: 1</w:t>
+      </w:r>
+    </w:p>
+    <w:p>
+      <w:r>
+        <w:t>Related Use Case: UC-07</w:t>
+      </w:r>
+    </w:p>
+    <w:p/>
+    <w:p>
+      <w:r>
+        <w:lastRenderedPageBreak/>
+        <w:t>User Story ID: US-06</w:t>
+      </w:r>
+    </w:p>
+    <w:p>
+      <w:r>
+        <w:t>User Story: As a learner, I want to view my progress and scores so that I can track my awareness improvement.</w:t>
+      </w:r>
+    </w:p>
+    <w:p>
+      <w:r>
+        <w:t>Priority: 2</w:t>
+      </w:r>
+    </w:p>
+    <w:p>
+      <w:r>
+        <w:t>Related Use Case: UC-08</w:t>
+      </w:r>
+    </w:p>
+    <w:p/>
+    <w:p>
+      <w:r>
+        <w:t>User Story ID: US-07</w:t>
+      </w:r>
+    </w:p>
+    <w:p>
+      <w:r>
+        <w:t>User Story: As an administrator, I want to create and update training modules so that the platform remains relevant and useful.</w:t>
+      </w:r>
+    </w:p>
+    <w:p>
+      <w:r>
+        <w:t>Priority: 2</w:t>
+      </w:r>
+    </w:p>
+    <w:p>
+      <w:r>
+        <w:t>Related Use Case: UC-09</w:t>
+      </w:r>
+    </w:p>
+    <w:p/>
+    <w:p>
+      <w:r>
+        <w:t>User Story ID: US-08</w:t>
+      </w:r>
+    </w:p>
+    <w:p>
+      <w:r>
+        <w:t>User Story: As an administrator, I want to create and update simulation scenarios so that learners can practise against different attack types.</w:t>
+      </w:r>
+    </w:p>
+    <w:p>
+      <w:r>
+        <w:t>Priority: 2</w:t>
+      </w:r>
+    </w:p>
+    <w:p>
+      <w:r>
+        <w:t>Related Use Case: UC-10</w:t>
+      </w:r>
+    </w:p>
+    <w:p/>
+    <w:p>
+      <w:r>
+        <w:t>User Story ID: US-09</w:t>
+      </w:r>
+    </w:p>
+    <w:p>
+      <w:r>
+        <w:t>User Story: As a trainer, I want to view learner reports so that I can identify users who need additional awareness support.</w:t>
+      </w:r>
+    </w:p>
+    <w:p>
+      <w:r>
+        <w:t>Priority: 2</w:t>
+      </w:r>
+    </w:p>
+    <w:p>
+      <w:r>
+        <w:t>Related Use Case: UC-11</w:t>
+      </w:r>
+    </w:p>
+    <w:p/>
+    <w:p>
+      <w:r>
+        <w:t>User Story ID: US-10</w:t>
+      </w:r>
+    </w:p>
+    <w:p>
+      <w:r>
+        <w:t>User Story: As an administrator, I want to manage user roles so that learners cannot access administrator functions.</w:t>
+      </w:r>
+    </w:p>
+    <w:p>
+      <w:r>
+        <w:t>Priority: 1</w:t>
+      </w:r>
+    </w:p>
+    <w:p>
+      <w:r>
+        <w:t>Related Use Case: UC-12</w:t>
+      </w:r>
+    </w:p>
+    <w:p/>
+    <w:p>
+      <w:r>
+        <w:t>User Story ID: US-11</w:t>
+      </w:r>
+    </w:p>
+    <w:p>
+      <w:r>
+        <w:t>User Story: As a system maintainer, I want to monitor deployment settings so that the system remains available and maintainable.</w:t>
+      </w:r>
+    </w:p>
+    <w:p>
+      <w:r>
+        <w:t>Priority: 3</w:t>
+      </w:r>
+    </w:p>
+    <w:p>
+      <w:r>
+        <w:t>Related Use Case: UC-13</w:t>
+      </w:r>
+    </w:p>
+    <w:p/>
+    <w:p>
+      <w:r>
+        <w:t>User Story ID: US-12</w:t>
+      </w:r>
+    </w:p>
+    <w:p>
+      <w:r>
+        <w:t>User Story: As a trainer, I want high-risk learner responses to be highlighted so that I can focus training support on users who are most vulnerable.</w:t>
+      </w:r>
+    </w:p>
+    <w:p>
+      <w:r>
+        <w:t>Priority: 3</w:t>
+      </w:r>
+    </w:p>
+    <w:p>
+      <w:r>
+        <w:t>Related Use Case: UC-11</w:t>
+      </w:r>
+    </w:p>
+    <w:p/>
+    <w:p>
+      <w:r>
+        <w:t>3.2 Functional Requirements</w:t>
+      </w:r>
+    </w:p>
+    <w:p/>
+    <w:p>
+      <w:r>
+        <w:t>Functional requirements describe the services and behaviours that the CyberAware system shall provide.</w:t>
+      </w:r>
+    </w:p>
+    <w:p/>
+    <w:p>
+      <w:r>
+        <w:t>Table: Functional Requirements</w:t>
+      </w:r>
+    </w:p>
+    <w:p/>
+    <w:p>
+      <w:r>
+        <w:t>Requirement ID: FR-01</w:t>
+      </w:r>
+    </w:p>
+    <w:p>
+      <w:r>
+        <w:t>Requirement: The system shall allow learners to register an account using valid user details.</w:t>
+      </w:r>
+    </w:p>
+    <w:p>
+      <w:r>
+        <w:t>Use Case Reference: UC-01</w:t>
+      </w:r>
+    </w:p>
+    <w:p>
+      <w:r>
+        <w:t>Stage: Stage 1</w:t>
+      </w:r>
+    </w:p>
+    <w:p>
+      <w:r>
+        <w:t>Priority: 1</w:t>
+      </w:r>
+    </w:p>
+    <w:p>
+      <w:r>
+        <w:t>Dependency: None</w:t>
+      </w:r>
+    </w:p>
+    <w:p>
+      <w:r>
+        <w:t>Comment: Registration is required to save learner progress.</w:t>
+      </w:r>
+    </w:p>
+    <w:p/>
+    <w:p>
+      <w:r>
+        <w:lastRenderedPageBreak/>
+        <w:t>Requirement ID: FR-02</w:t>
+      </w:r>
+    </w:p>
+    <w:p>
+      <w:r>
+        <w:t>Requirement: The system shall allow registered users to log in using valid credentials.</w:t>
+      </w:r>
+    </w:p>
+    <w:p>
+      <w:r>
+        <w:t>Use Case Reference: UC-02</w:t>
+      </w:r>
+    </w:p>
+    <w:p>
+      <w:r>
+        <w:t>Stage: Stage 1</w:t>
+      </w:r>
+    </w:p>
+    <w:p>
+      <w:r>
+        <w:t>Priority: 1</w:t>
+      </w:r>
+    </w:p>
+    <w:p>
+      <w:r>
+        <w:t>Dependency: FR-01</w:t>
+      </w:r>
+    </w:p>
+    <w:p>
+      <w:r>
+        <w:t>Comment: Login is required before accessing dashboards.</w:t>
+      </w:r>
+    </w:p>
+    <w:p/>
+    <w:p>
+      <w:r>
+        <w:t>Requirement ID: FR-03</w:t>
+      </w:r>
+    </w:p>
+    <w:p>
+      <w:r>
+        <w:t>Requirement: The system shall redirect users to the correct dashboard based on their role.</w:t>
+      </w:r>
+    </w:p>
+    <w:p>
+      <w:r>
+        <w:t>Use Case Reference: UC-02</w:t>
+      </w:r>
+    </w:p>
+    <w:p>
+      <w:r>
+        <w:t>Stage: Stage 1</w:t>
+      </w:r>
+    </w:p>
+    <w:p>
+      <w:r>
+        <w:t>Priority: 1</w:t>
+      </w:r>
+    </w:p>
+    <w:p>
+      <w:r>
+        <w:t>Dependency: FR-02</w:t>
+      </w:r>
+    </w:p>
+    <w:p>
+      <w:r>
+        <w:t>Comment: Learners and administrators must have different access levels.</w:t>
+      </w:r>
+    </w:p>
+    <w:p/>
+    <w:p>
+      <w:r>
+        <w:t>Requirement ID: FR-04</w:t>
+      </w:r>
+    </w:p>
+    <w:p>
+      <w:r>
+        <w:t>Requirement: The system shall display available social engineering awareness modules to learners.</w:t>
+      </w:r>
+    </w:p>
+    <w:p>
+      <w:r>
+        <w:t>Use Case Reference: UC-03</w:t>
+      </w:r>
+    </w:p>
+    <w:p>
+      <w:r>
+        <w:t>Stage: Stage 1</w:t>
+      </w:r>
+    </w:p>
+    <w:p>
+      <w:r>
+        <w:t>Priority: 1</w:t>
+      </w:r>
+    </w:p>
+    <w:p>
+      <w:r>
+        <w:t>Dependency: FR-02</w:t>
+      </w:r>
+    </w:p>
+    <w:p>
+      <w:r>
+        <w:t>Comment: Modules include phishing, fake login pages, SMS scams, suspicious links, impersonation, and pretexting.</w:t>
+      </w:r>
+    </w:p>
+    <w:p/>
+    <w:p>
+      <w:r>
+        <w:t>Requirement ID: FR-05</w:t>
+      </w:r>
+    </w:p>
+    <w:p>
+      <w:r>
+        <w:lastRenderedPageBreak/>
+        <w:t>Requirement: The system shall allow learners to open and complete a selected awareness module.</w:t>
+      </w:r>
+    </w:p>
+    <w:p>
+      <w:r>
+        <w:t>Use Case Reference: UC-04</w:t>
+      </w:r>
+    </w:p>
+    <w:p>
+      <w:r>
+        <w:t>Stage: Stage 1</w:t>
+      </w:r>
+    </w:p>
+    <w:p>
+      <w:r>
+        <w:t>Priority: 1</w:t>
+      </w:r>
+    </w:p>
+    <w:p>
+      <w:r>
+        <w:t>Dependency: FR-04</w:t>
+      </w:r>
+    </w:p>
+    <w:p>
+      <w:r>
+        <w:t>Comment: Training content prepares users before simulations.</w:t>
+      </w:r>
+    </w:p>
+    <w:p/>
+    <w:p>
+      <w:r>
+        <w:t>Requirement ID: FR-06</w:t>
+      </w:r>
+    </w:p>
+    <w:p>
+      <w:r>
+        <w:t>Requirement: The system shall present simulated social engineering scenarios to learners.</w:t>
+      </w:r>
+    </w:p>
+    <w:p>
+      <w:r>
+        <w:t>Use Case Reference: UC-05</w:t>
+      </w:r>
+    </w:p>
+    <w:p>
+      <w:r>
+        <w:t>Stage: Stage 2</w:t>
+      </w:r>
+    </w:p>
+    <w:p>
+      <w:r>
+        <w:t>Priority: 1</w:t>
+      </w:r>
+    </w:p>
+    <w:p>
+      <w:r>
+        <w:t>Dependency: FR-05</w:t>
+      </w:r>
+    </w:p>
+    <w:p>
+      <w:r>
+        <w:t>Comment: Scenarios must be safe and educational.</w:t>
+      </w:r>
+    </w:p>
+    <w:p/>
+    <w:p>
+      <w:r>
+        <w:t>Requirement ID: FR-07</w:t>
+      </w:r>
+    </w:p>
+    <w:p>
+      <w:r>
+        <w:t>Requirement: The system shall allow learners to submit responses to simulation scenarios.</w:t>
+      </w:r>
+    </w:p>
+    <w:p>
+      <w:r>
+        <w:t>Use Case Reference: UC-05</w:t>
+      </w:r>
+    </w:p>
+    <w:p>
+      <w:r>
+        <w:t>Stage: Stage 2</w:t>
+      </w:r>
+    </w:p>
+    <w:p>
+      <w:r>
+        <w:t>Priority: 1</w:t>
+      </w:r>
+    </w:p>
+    <w:p>
+      <w:r>
+        <w:t>Dependency: FR-06</w:t>
+      </w:r>
+    </w:p>
+    <w:p>
+      <w:r>
+        <w:t>Comment: Responses are used for scoring and feedback.</w:t>
+      </w:r>
+    </w:p>
+    <w:p/>
+    <w:p>
+      <w:r>
+        <w:t>Requirement ID: FR-08</w:t>
+      </w:r>
+    </w:p>
+    <w:p>
+      <w:r>
+        <w:t>Requirement: The system shall calculate learner scores based on quiz and scenario responses.</w:t>
+      </w:r>
+    </w:p>
+    <w:p>
+      <w:r>
+        <w:lastRenderedPageBreak/>
+        <w:t>Use Case Reference: UC-06</w:t>
+      </w:r>
+    </w:p>
+    <w:p>
+      <w:r>
+        <w:t>Stage: Stage 2</w:t>
+      </w:r>
+    </w:p>
+    <w:p>
+      <w:r>
+        <w:t>Priority: 1</w:t>
+      </w:r>
+    </w:p>
+    <w:p>
+      <w:r>
+        <w:t>Dependency: FR-07</w:t>
+      </w:r>
+    </w:p>
+    <w:p>
+      <w:r>
+        <w:t>Comment: Scoring supports progress tracking.</w:t>
+      </w:r>
+    </w:p>
+    <w:p/>
+    <w:p>
+      <w:r>
+        <w:t>Requirement ID: FR-09</w:t>
+      </w:r>
+    </w:p>
+    <w:p>
+      <w:r>
+        <w:t>Requirement: The system shall provide immediate feedback after learners submit simulation or quiz responses.</w:t>
+      </w:r>
+    </w:p>
+    <w:p>
+      <w:r>
+        <w:t>Use Case Reference: UC-07</w:t>
+      </w:r>
+    </w:p>
+    <w:p>
+      <w:r>
+        <w:t>Stage: Stage 2</w:t>
+      </w:r>
+    </w:p>
+    <w:p>
+      <w:r>
+        <w:t>Priority: 1</w:t>
+      </w:r>
+    </w:p>
+    <w:p>
+      <w:r>
+        <w:t>Dependency: FR-08</w:t>
+      </w:r>
+    </w:p>
+    <w:p>
+      <w:r>
+        <w:t>Comment: Feedback explains safe and risky choices.</w:t>
+      </w:r>
+    </w:p>
+    <w:p/>
+    <w:p>
+      <w:r>
+        <w:t>Requirement ID: FR-10</w:t>
+      </w:r>
+    </w:p>
+    <w:p>
+      <w:r>
+        <w:t>Requirement: The system shall allow learners to view their progress report.</w:t>
+      </w:r>
+    </w:p>
+    <w:p>
+      <w:r>
+        <w:t>Use Case Reference: UC-08</w:t>
+      </w:r>
+    </w:p>
+    <w:p>
+      <w:r>
+        <w:t>Stage: Stage 2</w:t>
+      </w:r>
+    </w:p>
+    <w:p>
+      <w:r>
+        <w:t>Priority: 2</w:t>
+      </w:r>
+    </w:p>
+    <w:p>
+      <w:r>
+        <w:t>Dependency: FR-08</w:t>
+      </w:r>
+    </w:p>
+    <w:p>
+      <w:r>
+        <w:t>Comment: Reports show module completion and score trends.</w:t>
+      </w:r>
+    </w:p>
+    <w:p/>
+    <w:p>
+      <w:r>
+        <w:t>Requirement ID: FR-11</w:t>
+      </w:r>
+    </w:p>
+    <w:p>
+      <w:r>
+        <w:t>Requirement: The system shall allow administrators to create, update, and remove training modules.</w:t>
+      </w:r>
+    </w:p>
+    <w:p>
+      <w:r>
+        <w:t>Use Case Reference: UC-09</w:t>
+      </w:r>
+    </w:p>
+    <w:p>
+      <w:r>
+        <w:t>Stage: Stage 3</w:t>
+      </w:r>
+    </w:p>
+    <w:p>
+      <w:r>
+        <w:t>Priority: 2</w:t>
+      </w:r>
+    </w:p>
+    <w:p>
+      <w:r>
+        <w:lastRenderedPageBreak/>
+        <w:t>Dependency: FR-03</w:t>
+      </w:r>
+    </w:p>
+    <w:p>
+      <w:r>
+        <w:t>Comment: Admin content control supports long-term maintainability.</w:t>
+      </w:r>
+    </w:p>
+    <w:p/>
+    <w:p>
+      <w:r>
+        <w:t>Requirement ID: FR-12</w:t>
+      </w:r>
+    </w:p>
+    <w:p>
+      <w:r>
+        <w:t>Requirement: The system shall allow administrators to create, update, and remove simulation scenarios.</w:t>
+      </w:r>
+    </w:p>
+    <w:p>
+      <w:r>
+        <w:t>Use Case Reference: UC-10</w:t>
+      </w:r>
+    </w:p>
+    <w:p>
+      <w:r>
+        <w:t>Stage: Stage 3</w:t>
+      </w:r>
+    </w:p>
+    <w:p>
+      <w:r>
+        <w:t>Priority: 2</w:t>
+      </w:r>
+    </w:p>
+    <w:p>
+      <w:r>
+        <w:t>Dependency: FR-03</w:t>
+      </w:r>
+    </w:p>
+    <w:p>
+      <w:r>
+        <w:t>Comment: Scenario updates help the system stay relevant.</w:t>
+      </w:r>
+    </w:p>
+    <w:p/>
+    <w:p>
+      <w:r>
+        <w:t>Requirement ID: FR-13</w:t>
+      </w:r>
+    </w:p>
+    <w:p>
+      <w:r>
+        <w:t>Requirement: The system shall allow trainers and administrators to view learner performance reports.</w:t>
+      </w:r>
+    </w:p>
+    <w:p>
+      <w:r>
+        <w:t>Use Case Reference: UC-11</w:t>
+      </w:r>
+    </w:p>
+    <w:p>
+      <w:r>
+        <w:t>Stage: Stage 3</w:t>
+      </w:r>
+    </w:p>
+    <w:p>
+      <w:r>
+        <w:t>Priority: 2</w:t>
+      </w:r>
+    </w:p>
+    <w:p>
+      <w:r>
+        <w:t>Dependency: FR-10</w:t>
+      </w:r>
+    </w:p>
+    <w:p>
+      <w:r>
+        <w:t>Comment: Reports support targeted awareness improvement.</w:t>
+      </w:r>
+    </w:p>
+    <w:p/>
+    <w:p>
+      <w:r>
+        <w:t>Requirement ID: FR-14</w:t>
+      </w:r>
+    </w:p>
+    <w:p>
+      <w:r>
+        <w:t>Requirement: The system shall identify high-risk responses, such as clicking a suspicious link or trusting a fake login page.</w:t>
+      </w:r>
+    </w:p>
+    <w:p>
+      <w:r>
+        <w:t>Use Case Reference: UC-11</w:t>
+      </w:r>
+    </w:p>
+    <w:p>
+      <w:r>
+        <w:t>Stage: Stage 3</w:t>
+      </w:r>
+    </w:p>
+    <w:p>
+      <w:r>
+        <w:t>Priority: 3</w:t>
+      </w:r>
+    </w:p>
+    <w:p>
+      <w:r>
+        <w:t>Dependency: FR-08</w:t>
+      </w:r>
+    </w:p>
+    <w:p>
+      <w:r>
+        <w:t>Comment: High-risk responses help trainers prioritise support.</w:t>
+      </w:r>
+    </w:p>
+    <w:p/>
+    <w:p>
+      <w:r>
+        <w:t>Requirement ID: FR-15</w:t>
+      </w:r>
+    </w:p>
+    <w:p>
+      <w:r>
+        <w:t>Requirement: The system shall allow administrators to manage user accounts and roles.</w:t>
+      </w:r>
+    </w:p>
+    <w:p>
+      <w:r>
+        <w:t>Use Case Reference: UC-12</w:t>
+      </w:r>
+    </w:p>
+    <w:p>
+      <w:r>
+        <w:t>Stage: Stage 3</w:t>
+      </w:r>
+    </w:p>
+    <w:p>
+      <w:r>
+        <w:t>Priority: 1</w:t>
+      </w:r>
+    </w:p>
+    <w:p>
+      <w:r>
+        <w:t>Dependency: FR-03</w:t>
+      </w:r>
+    </w:p>
+    <w:p>
+      <w:r>
+        <w:t>Comment: Role management is required for secure access control.</w:t>
+      </w:r>
+    </w:p>
+    <w:p/>
+    <w:p>
+      <w:r>
+        <w:t>3.3 Non-Functional Requirements</w:t>
+      </w:r>
+    </w:p>
+    <w:p/>
+    <w:p>
+      <w:r>
+        <w:t>Non-functional requirements describe the quality attributes and operational constraints of the CyberAware system.</w:t>
+      </w:r>
+    </w:p>
+    <w:p/>
+    <w:p>
+      <w:r>
+        <w:t>3.3.1 Performance Requirements</w:t>
+      </w:r>
+    </w:p>
+    <w:p/>
+    <w:p>
+      <w:r>
+        <w:t>Requirement ID: NFR-01</w:t>
+      </w:r>
+    </w:p>
+    <w:p>
+      <w:r>
+        <w:t>Requirement: The system shall load main prototype pages within three seconds under normal browser conditions.</w:t>
+      </w:r>
+    </w:p>
+    <w:p>
+      <w:r>
+        <w:t>Priority: 2</w:t>
+      </w:r>
+    </w:p>
+    <w:p>
+      <w:r>
+        <w:t>Comment: Fast loading improves usability.</w:t>
+      </w:r>
+    </w:p>
+    <w:p/>
+    <w:p>
+      <w:r>
+        <w:t>Requirement ID: NFR-02</w:t>
+      </w:r>
+    </w:p>
+    <w:p>
+      <w:r>
+        <w:t>Requirement: The system shall display quiz feedback within three seconds after response submission in the prototype.</w:t>
+      </w:r>
+    </w:p>
+    <w:p>
+      <w:r>
+        <w:t>Priority: 2</w:t>
+      </w:r>
+    </w:p>
+    <w:p>
+      <w:r>
+        <w:t>Comment: Immediate feedback is important for learning.</w:t>
+      </w:r>
+    </w:p>
+    <w:p/>
+    <w:p>
+      <w:r>
+        <w:lastRenderedPageBreak/>
+        <w:t>Requirement ID: NFR-03</w:t>
+      </w:r>
+    </w:p>
+    <w:p>
+      <w:r>
+        <w:t>Requirement: The future full system should support at least 100 concurrent learners in a small institutional environment.</w:t>
+      </w:r>
+    </w:p>
+    <w:p>
+      <w:r>
+        <w:t>Priority: 3</w:t>
+      </w:r>
+    </w:p>
+    <w:p>
+      <w:r>
+        <w:t>Comment: This is a future scalability target.</w:t>
+      </w:r>
+    </w:p>
+    <w:p/>
+    <w:p>
+      <w:r>
+        <w:t>3.3.2 Maintenance and Support Requirements</w:t>
+      </w:r>
+    </w:p>
+    <w:p/>
+    <w:p>
+      <w:r>
+        <w:t>Requirement ID: NFR-04</w:t>
+      </w:r>
+    </w:p>
+    <w:p>
+      <w:r>
+        <w:t>Requirement: The system shall use a modular design so that training modules, scenarios, scoring, and reporting can be updated separately.</w:t>
+      </w:r>
+    </w:p>
+    <w:p>
+      <w:r>
+        <w:t>Priority: 2</w:t>
+      </w:r>
+    </w:p>
+    <w:p>
+      <w:r>
+        <w:t>Comment: Modular design improves maintainability.</w:t>
+      </w:r>
+    </w:p>
+    <w:p/>
+    <w:p>
+      <w:r>
+        <w:t>Requirement ID: NFR-05</w:t>
+      </w:r>
+    </w:p>
+    <w:p>
+      <w:r>
+        <w:t>Requirement: The system shall maintain clear documentation for requirements, design, testing, deployment, and contribution evidence.</w:t>
+      </w:r>
+    </w:p>
+    <w:p>
+      <w:r>
+        <w:t>Priority: 1</w:t>
+      </w:r>
+    </w:p>
+    <w:p>
+      <w:r>
+        <w:t>Comment: Documentation is required for academic submission and future maintenance.</w:t>
+      </w:r>
+    </w:p>
+    <w:p/>
+    <w:p>
+      <w:r>
+        <w:t>Requirement ID: NFR-06</w:t>
+      </w:r>
+    </w:p>
+    <w:p>
+      <w:r>
+        <w:t>Requirement: The future full system should include regular backup procedures for learner records and training data.</w:t>
+      </w:r>
+    </w:p>
+    <w:p>
+      <w:r>
+        <w:t>Priority: 3</w:t>
+      </w:r>
+    </w:p>
+    <w:p>
+      <w:r>
+        <w:t>Comment: Backup planning reduces data loss risk.</w:t>
+      </w:r>
+    </w:p>
+    <w:p/>
+    <w:p>
+      <w:r>
+        <w:t>3.3.3 Security Requirements</w:t>
+      </w:r>
+    </w:p>
+    <w:p/>
+    <w:p>
+      <w:r>
+        <w:lastRenderedPageBreak/>
+        <w:t>Requirement ID: SR-01</w:t>
+      </w:r>
+    </w:p>
+    <w:p>
+      <w:r>
+        <w:t>Requirement: The system shall apply role-based access control so that learners cannot access administrator functions.</w:t>
+      </w:r>
+    </w:p>
+    <w:p>
+      <w:r>
+        <w:t>Priority: 1</w:t>
+      </w:r>
+    </w:p>
+    <w:p>
+      <w:r>
+        <w:t>Comment: Prevents broken access control.</w:t>
+      </w:r>
+    </w:p>
+    <w:p/>
+    <w:p>
+      <w:r>
+        <w:t>Requirement ID: SR-02</w:t>
+      </w:r>
+    </w:p>
+    <w:p>
+      <w:r>
+        <w:t>Requirement: The system shall validate user input in forms such as login, feedback, scenario creation, and search.</w:t>
+      </w:r>
+    </w:p>
+    <w:p>
+      <w:r>
+        <w:t>Priority: 1</w:t>
+      </w:r>
+    </w:p>
+    <w:p>
+      <w:r>
+        <w:t>Comment: Reduces injection and scripting risks.</w:t>
+      </w:r>
+    </w:p>
+    <w:p/>
+    <w:p>
+      <w:r>
+        <w:t>Requirement ID: SR-03</w:t>
+      </w:r>
+    </w:p>
+    <w:p>
+      <w:r>
+        <w:t>Requirement: The system shall avoid collecting real passwords or credentials inside simulation scenarios.</w:t>
+      </w:r>
+    </w:p>
+    <w:p>
+      <w:r>
+        <w:t>Priority: 1</w:t>
+      </w:r>
+    </w:p>
+    <w:p>
+      <w:r>
+        <w:t>Comment: Required for ethical and safe simulation design.</w:t>
+      </w:r>
+    </w:p>
+    <w:p/>
+    <w:p>
+      <w:r>
+        <w:t>Requirement ID: SR-04</w:t>
+      </w:r>
+    </w:p>
+    <w:p>
+      <w:r>
+        <w:t>Requirement: The future full system shall store passwords using secure hashing rather than plain text.</w:t>
+      </w:r>
+    </w:p>
+    <w:p>
+      <w:r>
+        <w:t>Priority: 1</w:t>
+      </w:r>
+    </w:p>
+    <w:p>
+      <w:r>
+        <w:t>Comment: Protects user accounts.</w:t>
+      </w:r>
+    </w:p>
+    <w:p/>
+    <w:p>
+      <w:r>
+        <w:t>Requirement ID: SR-05</w:t>
+      </w:r>
+    </w:p>
+    <w:p>
+      <w:r>
+        <w:t>Requirement: The system shall restrict learner performance reports to authorised trainers and administrators.</w:t>
+      </w:r>
+    </w:p>
+    <w:p>
+      <w:r>
+        <w:t>Priority: 1</w:t>
+      </w:r>
+    </w:p>
+    <w:p>
+      <w:r>
+        <w:t>Comment: Protects learner privacy.</w:t>
+      </w:r>
+    </w:p>
+    <w:p/>
+    <w:p>
+      <w:r>
+        <w:t>3.3.4 Scalability Requirements</w:t>
+      </w:r>
+    </w:p>
+    <w:p/>
+    <w:p>
+      <w:r>
+        <w:t>Requirement ID: NFR-07</w:t>
+      </w:r>
+    </w:p>
+    <w:p>
+      <w:r>
+        <w:t>Requirement: The system architecture should support future addition of new scenario types such as QR phishing, voice phishing, and AI-generated scam examples.</w:t>
+      </w:r>
+    </w:p>
+    <w:p>
+      <w:r>
+        <w:t>Priority: 4</w:t>
+      </w:r>
+    </w:p>
+    <w:p>
+      <w:r>
+        <w:t>Comment: Supports future extension.</w:t>
+      </w:r>
+    </w:p>
+    <w:p/>
+    <w:p>
+      <w:r>
+        <w:t>Requirement ID: NFR-08</w:t>
+      </w:r>
+    </w:p>
+    <w:p>
+      <w:r>
+        <w:t>Requirement: The system should support future integration with a Learning Management System.</w:t>
+      </w:r>
+    </w:p>
+    <w:p>
+      <w:r>
+        <w:t>Priority: 5</w:t>
+      </w:r>
+    </w:p>
+    <w:p>
+      <w:r>
+        <w:t>Comment: Future enhancement for institutional deployment.</w:t>
+      </w:r>
+    </w:p>
+    <w:p/>
+    <w:p>
+      <w:r>
+        <w:t>3.3.5 Legal and Ethical Requirements</w:t>
+      </w:r>
+    </w:p>
+    <w:p/>
+    <w:p>
+      <w:r>
+        <w:t>Requirement ID: LR-01</w:t>
+      </w:r>
+    </w:p>
+    <w:p>
+      <w:r>
+        <w:t>Requirement: The system shall use simulated training content only and shall not include real malicious links or real credential capture.</w:t>
+      </w:r>
+    </w:p>
+    <w:p>
+      <w:r>
+        <w:t>Priority: 1</w:t>
+      </w:r>
+    </w:p>
+    <w:p>
+      <w:r>
+        <w:t>Comment: Ensures ethical training design.</w:t>
+      </w:r>
+    </w:p>
+    <w:p/>
+    <w:p>
+      <w:r>
+        <w:t>Requirement ID: LR-02</w:t>
+      </w:r>
+    </w:p>
+    <w:p>
+      <w:r>
+        <w:t>Requirement: The system shall protect learner data and only display personal progress information to authorised users.</w:t>
+      </w:r>
+    </w:p>
+    <w:p>
+      <w:r>
+        <w:t>Priority: 1</w:t>
+      </w:r>
+    </w:p>
+    <w:p>
+      <w:r>
+        <w:t>Comment: Supports privacy and confidentiality.</w:t>
+      </w:r>
+    </w:p>
+    <w:p/>
+    <w:p>
+      <w:r>
+        <w:lastRenderedPageBreak/>
+        <w:t>Requirement ID: LR-03</w:t>
+      </w:r>
+    </w:p>
+    <w:p>
+      <w:r>
+        <w:t>Requirement: The report and prototype shall reference any external sources, tools, frameworks, or cybersecurity materials used.</w:t>
+      </w:r>
+    </w:p>
+    <w:p>
+      <w:r>
+        <w:t>Priority: 1</w:t>
+      </w:r>
+    </w:p>
+    <w:p>
+      <w:r>
+        <w:t>Comment: Supports academic integrity.</w:t>
+      </w:r>
+    </w:p>
+    <w:p/>
+    <w:p>
+      <w:r>
+        <w:t>3.4 Requirement Prioritisation</w:t>
+      </w:r>
+    </w:p>
+    <w:p/>
+    <w:p>
+      <w:r>
+        <w:t>The requirements were prioritised using a combination of the 1 to 5 priority scale and MoSCoW prioritisation.</w:t>
+      </w:r>
+    </w:p>
+    <w:p/>
+    <w:p>
+      <w:r>
+        <w:t>Must Have Requirements:</w:t>
+      </w:r>
+    </w:p>
+    <w:p/>
+    <w:p>
+      <w:r>
+        <w:t>• Secure login and role-based access.</w:t>
+      </w:r>
+    </w:p>
+    <w:p>
+      <w:r>
+        <w:t>• Learner dashboard.</w:t>
+      </w:r>
+    </w:p>
+    <w:p>
+      <w:r>
+        <w:t>• Training module access.</w:t>
+      </w:r>
+    </w:p>
+    <w:p>
+      <w:r>
+        <w:t>• Social engineering simulation scenarios.</w:t>
+      </w:r>
+    </w:p>
+    <w:p>
+      <w:r>
+        <w:t>• Quiz or response submission.</w:t>
+      </w:r>
+    </w:p>
+    <w:p>
+      <w:r>
+        <w:t>• Immediate feedback.</w:t>
+      </w:r>
+    </w:p>
+    <w:p>
+      <w:r>
+        <w:t>• Basic progress tracking.</w:t>
+      </w:r>
+    </w:p>
+    <w:p>
+      <w:r>
+        <w:t>• Administrator access control.</w:t>
+      </w:r>
+    </w:p>
+    <w:p>
+      <w:r>
+        <w:t>• Safe and ethical simulation design.</w:t>
+      </w:r>
+    </w:p>
+    <w:p/>
+    <w:p>
+      <w:r>
+        <w:t>Should Have Requirements:</w:t>
+      </w:r>
+    </w:p>
+    <w:p/>
+    <w:p>
+      <w:r>
+        <w:t>• Admin scenario management.</w:t>
+      </w:r>
+    </w:p>
+    <w:p>
+      <w:r>
+        <w:t>• Learner reports.</w:t>
+      </w:r>
+    </w:p>
+    <w:p>
+      <w:r>
+        <w:t>• High-risk response identification.</w:t>
+      </w:r>
+    </w:p>
+    <w:p>
+      <w:r>
+        <w:t>• Modular content update structure.</w:t>
+      </w:r>
+    </w:p>
+    <w:p>
+      <w:r>
+        <w:lastRenderedPageBreak/>
+        <w:t>• Security mitigation planning.</w:t>
+      </w:r>
+    </w:p>
+    <w:p/>
+    <w:p>
+      <w:r>
+        <w:t>Could Have Requirements:</w:t>
+      </w:r>
+    </w:p>
+    <w:p/>
+    <w:p>
+      <w:r>
+        <w:t>• Advanced analytics dashboard.</w:t>
+      </w:r>
+    </w:p>
+    <w:p>
+      <w:r>
+        <w:t>• Email notification reminders.</w:t>
+      </w:r>
+    </w:p>
+    <w:p>
+      <w:r>
+        <w:t>• Exportable reports.</w:t>
+      </w:r>
+    </w:p>
+    <w:p>
+      <w:r>
+        <w:t>• User confidence score.</w:t>
+      </w:r>
+    </w:p>
+    <w:p/>
+    <w:p>
+      <w:r>
+        <w:t>Future Requirements:</w:t>
+      </w:r>
+    </w:p>
+    <w:p/>
+    <w:p>
+      <w:r>
+        <w:t>• LMS integration.</w:t>
+      </w:r>
+    </w:p>
+    <w:p>
+      <w:r>
+        <w:t>• AI-based adaptive learning.</w:t>
+      </w:r>
+    </w:p>
+    <w:p>
+      <w:r>
+        <w:t>• Multi-language support.</w:t>
+      </w:r>
+    </w:p>
+    <w:p>
+      <w:r>
+        <w:t>• Voice phishing simulation.</w:t>
+      </w:r>
+    </w:p>
+    <w:p>
+      <w:r>
+        <w:t>• QR phishing simulation.</w:t>
+      </w:r>
+    </w:p>
+    <w:p>
+      <w:r>
+        <w:t>• Enterprise-level deployment and monitoring.</w:t>
+      </w:r>
+    </w:p>
+    <w:p/>
+    <w:p>
+      <w:r>
+        <w:t>3.5 Milestones</w:t>
+      </w:r>
+    </w:p>
+    <w:p/>
+    <w:p>
+      <w:r>
+        <w:t>The CyberAware project follows an Agile-incremental timeline.</w:t>
+      </w:r>
+    </w:p>
+    <w:p/>
+    <w:p>
+      <w:r>
+        <w:t>Table: Project Milestones</w:t>
+      </w:r>
+    </w:p>
+    <w:p/>
+    <w:p>
+      <w:r>
+        <w:t>Milestone ID: M1</w:t>
+      </w:r>
+    </w:p>
+    <w:p>
+      <w:r>
+        <w:t>Milestone: Project topic finalised</w:t>
+      </w:r>
+    </w:p>
+    <w:p>
+      <w:r>
+        <w:t>Description: Social Engineering Awareness Training selected and converted into CyberAware project concept.</w:t>
+      </w:r>
+    </w:p>
+    <w:p>
+      <w:r>
+        <w:lastRenderedPageBreak/>
+        <w:t>Expected Output: Confirmed project title and scope.</w:t>
+      </w:r>
+    </w:p>
+    <w:p/>
+    <w:p>
+      <w:r>
+        <w:t>Milestone ID: M2</w:t>
+      </w:r>
+    </w:p>
+    <w:p>
+      <w:r>
+        <w:t>Milestone: Repository and project structure setup</w:t>
+      </w:r>
+    </w:p>
+    <w:p>
+      <w:r>
+        <w:t>Description: GitHub repository, folders, README, and project plan created.</w:t>
+      </w:r>
+    </w:p>
+    <w:p>
+      <w:r>
+        <w:t>Expected Output: Version-controlled project workspace.</w:t>
+      </w:r>
+    </w:p>
+    <w:p/>
+    <w:p>
+      <w:r>
+        <w:t>Milestone ID: M3</w:t>
+      </w:r>
+    </w:p>
+    <w:p>
+      <w:r>
+        <w:t>Milestone: Requirements finalised</w:t>
+      </w:r>
+    </w:p>
+    <w:p>
+      <w:r>
+        <w:t>Description: Use cases, user stories, functional requirements, non-functional requirements, and priority list completed.</w:t>
+      </w:r>
+    </w:p>
+    <w:p>
+      <w:r>
+        <w:t>Expected Output: Software Requirements section.</w:t>
+      </w:r>
+    </w:p>
+    <w:p/>
+    <w:p>
+      <w:r>
+        <w:t>Milestone ID: M4</w:t>
+      </w:r>
+    </w:p>
+    <w:p>
+      <w:r>
+        <w:t>Milestone: Prototype design completed</w:t>
+      </w:r>
+    </w:p>
+    <w:p>
+      <w:r>
+        <w:t>Description: Main learner and administrator screens created using HTML, CSS, and JavaScript.</w:t>
+      </w:r>
+    </w:p>
+    <w:p>
+      <w:r>
+        <w:t>Expected Output: GitHub Pages digital prototype.</w:t>
+      </w:r>
+    </w:p>
+    <w:p/>
+    <w:p>
+      <w:r>
+        <w:t>Milestone ID: M5</w:t>
+      </w:r>
+    </w:p>
+    <w:p>
+      <w:r>
+        <w:t>Milestone: UML diagrams completed</w:t>
+      </w:r>
+    </w:p>
+    <w:p>
+      <w:r>
+        <w:t>Description: Use case, sequence, class, ER, activity, state, and architecture diagrams prepared.</w:t>
+      </w:r>
+    </w:p>
+    <w:p>
+      <w:r>
+        <w:t>Expected Output: Software Design section and appendix images.</w:t>
+      </w:r>
+    </w:p>
+    <w:p/>
+    <w:p>
+      <w:r>
+        <w:t>Milestone ID: M6</w:t>
+      </w:r>
+    </w:p>
+    <w:p>
+      <w:r>
+        <w:t>Milestone: Test plan completed</w:t>
+      </w:r>
+    </w:p>
+    <w:p>
+      <w:r>
+        <w:t>Description: Test approach, test cases, security risks, mitigation strategies, and deployment plan completed.</w:t>
+      </w:r>
+    </w:p>
+    <w:p>
+      <w:r>
+        <w:lastRenderedPageBreak/>
+        <w:t>Expected Output: Software Test Plan section.</w:t>
+      </w:r>
+    </w:p>
+    <w:p/>
+    <w:p>
+      <w:r>
+        <w:t>Milestone ID: M7</w:t>
+      </w:r>
+    </w:p>
+    <w:p>
+      <w:r>
+        <w:t>Milestone: Final report completed</w:t>
+      </w:r>
+    </w:p>
+    <w:p>
+      <w:r>
+        <w:t>Description: Full report edited, formatted, referenced, and checked against rubric.</w:t>
+      </w:r>
+    </w:p>
+    <w:p>
+      <w:r>
+        <w:t>Expected Output: Final Word report and appendix evidence.</w:t>
+      </w:r>
+    </w:p>
+    <w:p/>
+    <w:p>
+      <w:r>
+        <w:t>3.6 Risks and Contingencies</w:t>
+      </w:r>
+    </w:p>
+    <w:p/>
+    <w:p>
+      <w:r>
+        <w:t>Table: Risks and Contingencies</w:t>
+      </w:r>
+    </w:p>
+    <w:p/>
+    <w:p>
+      <w:r>
+        <w:t>Risk ID: R-01</w:t>
+      </w:r>
+    </w:p>
+    <w:p>
+      <w:r>
+        <w:t>Risk: Prototype link does not work</w:t>
+      </w:r>
+    </w:p>
+    <w:p>
+      <w:r>
+        <w:t>Impact: High</w:t>
+      </w:r>
+    </w:p>
+    <w:p>
+      <w:r>
+        <w:t>Probability: Medium</w:t>
+      </w:r>
+    </w:p>
+    <w:p>
+      <w:r>
+        <w:t>Contingency/Mitigation: Deploy through GitHub Pages early, test link in different browsers, and include screenshots in appendix.</w:t>
+      </w:r>
+    </w:p>
+    <w:p/>
+    <w:p>
+      <w:r>
+        <w:t>Risk ID: R-02</w:t>
+      </w:r>
+    </w:p>
+    <w:p>
+      <w:r>
+        <w:t>Risk: Requirements are too broad for prototype scope</w:t>
+      </w:r>
+    </w:p>
+    <w:p>
+      <w:r>
+        <w:t>Impact: Medium</w:t>
+      </w:r>
+    </w:p>
+    <w:p>
+      <w:r>
+        <w:t>Probability: Medium</w:t>
+      </w:r>
+    </w:p>
+    <w:p>
+      <w:r>
+        <w:t>Contingency/Mitigation: Separate core prototype requirements from future enhancement requirements.</w:t>
+      </w:r>
+    </w:p>
+    <w:p/>
+    <w:p>
+      <w:r>
+        <w:t>Risk ID: R-03</w:t>
+      </w:r>
+    </w:p>
+    <w:p>
+      <w:r>
+        <w:t>Risk: Diagrams become too complex or unclear</w:t>
+      </w:r>
+    </w:p>
+    <w:p>
+      <w:r>
+        <w:t>Impact: Medium</w:t>
+      </w:r>
+    </w:p>
+    <w:p>
+      <w:r>
+        <w:t>Probability: Medium</w:t>
+      </w:r>
+    </w:p>
+    <w:p>
+      <w:r>
+        <w:lastRenderedPageBreak/>
+        <w:t>Contingency/Mitigation: Use simple UML notation, clear labels, and readable diagram layout.</w:t>
+      </w:r>
+    </w:p>
+    <w:p/>
+    <w:p>
+      <w:r>
+        <w:t>Risk ID: R-04</w:t>
+      </w:r>
+    </w:p>
+    <w:p>
+      <w:r>
+        <w:t>Risk: Social engineering scenarios appear harmful or unethical</w:t>
+      </w:r>
+    </w:p>
+    <w:p>
+      <w:r>
+        <w:t>Impact: High</w:t>
+      </w:r>
+    </w:p>
+    <w:p>
+      <w:r>
+        <w:t>Probability: Low</w:t>
+      </w:r>
+    </w:p>
+    <w:p>
+      <w:r>
+        <w:t>Contingency/Mitigation: Use only safe simulated content, avoid real links, and clearly label scenarios as training examples.</w:t>
+      </w:r>
+    </w:p>
+    <w:p/>
+    <w:p>
+      <w:r>
+        <w:t>Risk ID: R-05</w:t>
+      </w:r>
+    </w:p>
+    <w:p>
+      <w:r>
+        <w:t>Risk: Learner data privacy is not properly protected in design</w:t>
+      </w:r>
+    </w:p>
+    <w:p>
+      <w:r>
+        <w:t>Impact: High</w:t>
+      </w:r>
+    </w:p>
+    <w:p>
+      <w:r>
+        <w:t>Probability: Medium</w:t>
+      </w:r>
+    </w:p>
+    <w:p>
+      <w:r>
+        <w:t>Contingency/Mitigation: Apply role-based access control, data minimisation, and authorised report access.</w:t>
+      </w:r>
+    </w:p>
+    <w:p/>
+    <w:p>
+      <w:r>
+        <w:t>Risk ID: R-06</w:t>
+      </w:r>
+    </w:p>
+    <w:p>
+      <w:r>
+        <w:t>Risk: Group contribution evidence is weak</w:t>
+      </w:r>
+    </w:p>
+    <w:p>
+      <w:r>
+        <w:t>Impact: Medium</w:t>
+      </w:r>
+    </w:p>
+    <w:p>
+      <w:r>
+        <w:t>Probability: Medium</w:t>
+      </w:r>
+    </w:p>
+    <w:p>
+      <w:r>
+        <w:t>Contingency/Mitigation: Use GitHub commits, project-plan file, diagram uploads, screenshot notes, and individual contribution section.</w:t>
+      </w:r>
+    </w:p>
+    <w:p/>
+    <w:p>
+      <w:r>
+        <w:t>Risk ID: R-07</w:t>
+      </w:r>
+    </w:p>
+    <w:p>
+      <w:r>
+        <w:t>Risk: Time limitation affects final quality</w:t>
+      </w:r>
+    </w:p>
+    <w:p>
+      <w:r>
+        <w:t>Impact: High</w:t>
+      </w:r>
+    </w:p>
+    <w:p>
+      <w:r>
+        <w:t>Probability: High</w:t>
+      </w:r>
+    </w:p>
+    <w:p>
+      <w:r>
+        <w:lastRenderedPageBreak/>
+        <w:t>Contingency/Mitigation: Focus first on rubric-critical sections: requirements, design, prototype, testing, and contribution.</w:t>
+      </w:r>
+    </w:p>
+    <w:p/>
+    <w:p>
+      <w:r>
+        <w:t>3.7 Operating Environment</w:t>
+      </w:r>
+    </w:p>
+    <w:p/>
+    <w:p>
+      <w:r>
+        <w:t>The current prototype operating environment is lightweight and browser-based.</w:t>
+      </w:r>
+    </w:p>
+    <w:p/>
+    <w:p>
+      <w:r>
+        <w:t>Table: Operating Environment</w:t>
+      </w:r>
+    </w:p>
+    <w:p/>
+    <w:p>
+      <w:r>
+        <w:t>Component: Operating System</w:t>
+      </w:r>
+    </w:p>
+    <w:p>
+      <w:r>
+        <w:t>Specification: Windows 10/11, macOS, or Linux</w:t>
+      </w:r>
+    </w:p>
+    <w:p>
+      <w:r>
+        <w:t>Purpose: Development and browser access</w:t>
+      </w:r>
+    </w:p>
+    <w:p/>
+    <w:p>
+      <w:r>
+        <w:t>Component: Browser</w:t>
+      </w:r>
+    </w:p>
+    <w:p>
+      <w:r>
+        <w:t>Specification: Google Chrome, Microsoft Edge, Firefox</w:t>
+      </w:r>
+    </w:p>
+    <w:p>
+      <w:r>
+        <w:t>Purpose: Running and testing the GitHub Pages prototype</w:t>
+      </w:r>
+    </w:p>
+    <w:p/>
+    <w:p>
+      <w:r>
+        <w:t>Component: Code Editor</w:t>
+      </w:r>
+    </w:p>
+    <w:p>
+      <w:r>
+        <w:t>Specification: Visual Studio Code</w:t>
+      </w:r>
+    </w:p>
+    <w:p>
+      <w:r>
+        <w:t>Purpose: Editing HTML, CSS, JavaScript, and markdown files</w:t>
+      </w:r>
+    </w:p>
+    <w:p/>
+    <w:p>
+      <w:r>
+        <w:t>Component: Version Control</w:t>
+      </w:r>
+    </w:p>
+    <w:p>
+      <w:r>
+        <w:t>Specification: Git and GitHub</w:t>
+      </w:r>
+    </w:p>
+    <w:p>
+      <w:r>
+        <w:t>Purpose: Repository management and contribution evidence</w:t>
+      </w:r>
+    </w:p>
+    <w:p/>
+    <w:p>
+      <w:r>
+        <w:t>Component: Hosting</w:t>
+      </w:r>
+    </w:p>
+    <w:p>
+      <w:r>
+        <w:t>Specification: GitHub Pages</w:t>
+      </w:r>
+    </w:p>
+    <w:p>
+      <w:r>
+        <w:t>Purpose: Public prototype deployment</w:t>
+      </w:r>
+    </w:p>
+    <w:p/>
+    <w:p>
+      <w:r>
+        <w:t>Component: Diagram Tool</w:t>
+      </w:r>
+    </w:p>
+    <w:p>
+      <w:r>
+        <w:t>Specification: Draw.io or Lucidchart</w:t>
+      </w:r>
+    </w:p>
+    <w:p>
+      <w:r>
+        <w:t>Purpose: UML and architecture diagrams</w:t>
+      </w:r>
+    </w:p>
+    <w:p/>
+    <w:p>
+      <w:r>
+        <w:t>Component: Documentation Tool</w:t>
+      </w:r>
+    </w:p>
+    <w:p>
+      <w:r>
+        <w:t>Specification: Microsoft Word</w:t>
+      </w:r>
+    </w:p>
+    <w:p>
+      <w:r>
+        <w:t>Purpose: Final report writing and formatting</w:t>
+      </w:r>
+    </w:p>
+    <w:p/>
+    <w:p>
+      <w:r>
+        <w:t>Future full-system operating environment may include a backend server, database server, secure authentication service, HTTPS configuration, monitoring tools, and backup service.</w:t>
+      </w:r>
+    </w:p>
+    <w:p/>
+    <w:p>
+      <w:r>
+        <w:t>3.8 Assumptions and Dependencies</w:t>
+      </w:r>
+    </w:p>
+    <w:p/>
+    <w:p>
+      <w:r>
+        <w:t>3.8.1 Assumptions</w:t>
+      </w:r>
+    </w:p>
+    <w:p/>
+    <w:p>
+      <w:r>
+        <w:t>The following assumptions apply to the CyberAware project:</w:t>
+      </w:r>
+    </w:p>
+    <w:p/>
+    <w:p>
+      <w:r>
+        <w:t>• Users have access to a web browser and internet connection.</w:t>
+      </w:r>
+    </w:p>
+    <w:p>
+      <w:r>
+        <w:t>• Learners have basic computer literacy.</w:t>
+      </w:r>
+    </w:p>
+    <w:p>
+      <w:r>
+        <w:t>• The prototype is designed for academic demonstration rather than enterprise production.</w:t>
+      </w:r>
+    </w:p>
+    <w:p>
+      <w:r>
+        <w:t>• Simulation scenarios are safe, fictional, and educational.</w:t>
+      </w:r>
+    </w:p>
+    <w:p>
+      <w:r>
+        <w:t>• GitHub Pages remains available for hosting the prototype.</w:t>
+      </w:r>
+    </w:p>
+    <w:p>
+      <w:r>
+        <w:t>• Group members can contribute through GitHub, diagrams, screenshots, or documentation.</w:t>
+      </w:r>
+    </w:p>
+    <w:p>
+      <w:r>
+        <w:t>• The final report will follow the official PRT581 template and referencing requirements.</w:t>
+      </w:r>
+    </w:p>
+    <w:p/>
+    <w:p>
+      <w:r>
+        <w:lastRenderedPageBreak/>
+        <w:t>3.8.2 Dependencies</w:t>
+      </w:r>
+    </w:p>
+    <w:p/>
+    <w:p>
+      <w:r>
+        <w:t>The CyberAware project depends on the following:</w:t>
+      </w:r>
+    </w:p>
+    <w:p/>
+    <w:p>
+      <w:r>
+        <w:t>• GitHub repository access for version control.</w:t>
+      </w:r>
+    </w:p>
+    <w:p>
+      <w:r>
+        <w:t>• GitHub Pages for prototype deployment.</w:t>
+      </w:r>
+    </w:p>
+    <w:p>
+      <w:r>
+        <w:t>• Visual Studio Code or another editor for prototype development.</w:t>
+      </w:r>
+    </w:p>
+    <w:p>
+      <w:r>
+        <w:t>• Draw.io or Lucidchart for UML diagrams.</w:t>
+      </w:r>
+    </w:p>
+    <w:p>
+      <w:r>
+        <w:t>• Browser compatibility for viewing prototype screens.</w:t>
+      </w:r>
+    </w:p>
+    <w:p>
+      <w:r>
+        <w:t>• Microsoft Word for report preparation.</w:t>
+      </w:r>
+    </w:p>
+    <w:p>
+      <w:r>
+        <w:t>• Accurate references for software engineering, cybersecurity, OWASP, Agile, UML, and testing concepts.</w:t>
+      </w:r>
+    </w:p>
+    <w:p>
+      <w:r>
+        <w:t>• Timely completion of prototype, diagrams, and report sections.</w:t>
+      </w:r>
+    </w:p>
+    <w:p/>
+    <w:p>
+      <w:r>
+        <w:t>3.9 Requirement Traceability Matrix</w:t>
+      </w:r>
+    </w:p>
+    <w:p/>
+    <w:p>
+      <w:r>
+        <w:t>The Requirement Traceability Matrix links requirements to use cases and test cases. This ensures that each major requirement can be verified through testing.</w:t>
+      </w:r>
+    </w:p>
+    <w:p/>
+    <w:p>
+      <w:r>
+        <w:t>Table: Requirement Traceability Matrix</w:t>
+      </w:r>
+    </w:p>
+    <w:p/>
+    <w:p>
+      <w:r>
+        <w:t>Requirement ID: FR-01</w:t>
+      </w:r>
+    </w:p>
+    <w:p>
+      <w:r>
+        <w:t>Requirement Description: Learner registration</w:t>
+      </w:r>
+    </w:p>
+    <w:p>
+      <w:r>
+        <w:t>Related Use Case: UC-01</w:t>
+      </w:r>
+    </w:p>
+    <w:p>
+      <w:r>
+        <w:t>Related Test Case: TC-01</w:t>
+      </w:r>
+    </w:p>
+    <w:p/>
+    <w:p>
+      <w:r>
+        <w:t>Requirement ID: FR-02</w:t>
+      </w:r>
+    </w:p>
+    <w:p>
+      <w:r>
+        <w:t>Requirement Description: User login</w:t>
+      </w:r>
+    </w:p>
+    <w:p>
+      <w:r>
+        <w:t>Related Use Case: UC-02</w:t>
+      </w:r>
+    </w:p>
+    <w:p>
+      <w:r>
+        <w:lastRenderedPageBreak/>
+        <w:t>Related Test Case: TC-02</w:t>
+      </w:r>
+    </w:p>
+    <w:p/>
+    <w:p>
+      <w:r>
+        <w:t>Requirement ID: FR-03</w:t>
+      </w:r>
+    </w:p>
+    <w:p>
+      <w:r>
+        <w:t>Requirement Description: Role-based dashboard redirection</w:t>
+      </w:r>
+    </w:p>
+    <w:p>
+      <w:r>
+        <w:t>Related Use Case: UC-02</w:t>
+      </w:r>
+    </w:p>
+    <w:p>
+      <w:r>
+        <w:t>Related Test Case: TC-03</w:t>
+      </w:r>
+    </w:p>
+    <w:p/>
+    <w:p>
+      <w:r>
+        <w:t>Requirement ID: FR-04</w:t>
+      </w:r>
+    </w:p>
+    <w:p>
+      <w:r>
+        <w:t>Requirement Description: Display training modules</w:t>
+      </w:r>
+    </w:p>
+    <w:p>
+      <w:r>
+        <w:t>Related Use Case: UC-03</w:t>
+      </w:r>
+    </w:p>
+    <w:p>
+      <w:r>
+        <w:t>Related Test Case: TC-04</w:t>
+      </w:r>
+    </w:p>
+    <w:p/>
+    <w:p>
+      <w:r>
+        <w:t>Requirement ID: FR-05</w:t>
+      </w:r>
+    </w:p>
+    <w:p>
+      <w:r>
+        <w:t>Requirement Description: Complete awareness module</w:t>
+      </w:r>
+    </w:p>
+    <w:p>
+      <w:r>
+        <w:t>Related Use Case: UC-04</w:t>
+      </w:r>
+    </w:p>
+    <w:p>
+      <w:r>
+        <w:t>Related Test Case: TC-05</w:t>
+      </w:r>
+    </w:p>
+    <w:p/>
+    <w:p>
+      <w:r>
+        <w:t>Requirement ID: FR-06</w:t>
+      </w:r>
+    </w:p>
+    <w:p>
+      <w:r>
+        <w:t>Requirement Description: Present simulation scenarios</w:t>
+      </w:r>
+    </w:p>
+    <w:p>
+      <w:r>
+        <w:t>Related Use Case: UC-05</w:t>
+      </w:r>
+    </w:p>
+    <w:p>
+      <w:r>
+        <w:t>Related Test Case: TC-06</w:t>
+      </w:r>
+    </w:p>
+    <w:p/>
+    <w:p>
+      <w:r>
+        <w:t>Requirement ID: FR-07</w:t>
+      </w:r>
+    </w:p>
+    <w:p>
+      <w:r>
+        <w:t>Requirement Description: Submit simulation responses</w:t>
+      </w:r>
+    </w:p>
+    <w:p>
+      <w:r>
+        <w:t>Related Use Case: UC-05</w:t>
+      </w:r>
+    </w:p>
+    <w:p>
+      <w:r>
+        <w:t>Related Test Case: TC-07</w:t>
+      </w:r>
+    </w:p>
+    <w:p/>
+    <w:p>
+      <w:r>
+        <w:t>Requirement ID: FR-08</w:t>
+      </w:r>
+    </w:p>
+    <w:p>
+      <w:r>
+        <w:lastRenderedPageBreak/>
+        <w:t>Requirement Description: Calculate learner scores</w:t>
+      </w:r>
+    </w:p>
+    <w:p>
+      <w:r>
+        <w:t>Related Use Case: UC-06</w:t>
+      </w:r>
+    </w:p>
+    <w:p>
+      <w:r>
+        <w:t>Related Test Case: TC-08</w:t>
+      </w:r>
+    </w:p>
+    <w:p/>
+    <w:p>
+      <w:r>
+        <w:t>Requirement ID: FR-09</w:t>
+      </w:r>
+    </w:p>
+    <w:p>
+      <w:r>
+        <w:t>Requirement Description: Provide immediate feedback</w:t>
+      </w:r>
+    </w:p>
+    <w:p>
+      <w:r>
+        <w:t>Related Use Case: UC-07</w:t>
+      </w:r>
+    </w:p>
+    <w:p>
+      <w:r>
+        <w:t>Related Test Case: TC-09</w:t>
+      </w:r>
+    </w:p>
+    <w:p/>
+    <w:p>
+      <w:r>
+        <w:t>Requirement ID: FR-10</w:t>
+      </w:r>
+    </w:p>
+    <w:p>
+      <w:r>
+        <w:t>Requirement Description: View learner progress report</w:t>
+      </w:r>
+    </w:p>
+    <w:p>
+      <w:r>
+        <w:t>Related Use Case: UC-08</w:t>
+      </w:r>
+    </w:p>
+    <w:p>
+      <w:r>
+        <w:t>Related Test Case: TC-10</w:t>
+      </w:r>
+    </w:p>
+    <w:p/>
+    <w:p>
+      <w:r>
+        <w:t>Requirement ID: FR-11</w:t>
+      </w:r>
+    </w:p>
+    <w:p>
+      <w:r>
+        <w:t>Requirement Description: Manage training modules</w:t>
+      </w:r>
+    </w:p>
+    <w:p>
+      <w:r>
+        <w:t>Related Use Case: UC-09</w:t>
+      </w:r>
+    </w:p>
+    <w:p>
+      <w:r>
+        <w:t>Related Test Case: TC-11</w:t>
+      </w:r>
+    </w:p>
+    <w:p/>
+    <w:p>
+      <w:r>
+        <w:t>Requirement ID: FR-12</w:t>
+      </w:r>
+    </w:p>
+    <w:p>
+      <w:r>
+        <w:t>Requirement Description: Manage simulation scenarios</w:t>
+      </w:r>
+    </w:p>
+    <w:p>
+      <w:r>
+        <w:t>Related Use Case: UC-10</w:t>
+      </w:r>
+    </w:p>
+    <w:p>
+      <w:r>
+        <w:t>Related Test Case: TC-12</w:t>
+      </w:r>
+    </w:p>
+    <w:p/>
+    <w:p>
+      <w:r>
+        <w:t>Requirement ID: FR-13</w:t>
+      </w:r>
+    </w:p>
+    <w:p>
+      <w:r>
+        <w:t>Requirement Description: View learner performance reports</w:t>
+      </w:r>
+    </w:p>
+    <w:p>
+      <w:r>
+        <w:t>Related Use Case: UC-11</w:t>
+      </w:r>
+    </w:p>
+    <w:p>
+      <w:r>
+        <w:t>Related Test Case: TC-13</w:t>
+      </w:r>
+    </w:p>
+    <w:p/>
+    <w:p>
+      <w:r>
+        <w:t>Requirement ID: FR-15</w:t>
+      </w:r>
+    </w:p>
+    <w:p>
+      <w:r>
+        <w:t>Requirement Description: Manage users and roles</w:t>
+      </w:r>
+    </w:p>
+    <w:p>
+      <w:r>
+        <w:t>Related Use Case: UC-12</w:t>
+      </w:r>
+    </w:p>
+    <w:p>
+      <w:r>
+        <w:t>Related Test Case: TC-14</w:t>
+      </w:r>
+    </w:p>
+    <w:p/>
+    <w:p>
+      <w:r>
+        <w:t>Requirement ID: SR-01</w:t>
+      </w:r>
+    </w:p>
+    <w:p>
+      <w:r>
+        <w:t>Requirement Description: Restrict learner access to admin functions</w:t>
+      </w:r>
+    </w:p>
+    <w:p>
+      <w:r>
+        <w:t>Related Use Case: UC-12</w:t>
+      </w:r>
+    </w:p>
+    <w:p>
+      <w:r>
+        <w:t>Related Test Case: TC-15</w:t>
+      </w:r>
+    </w:p>
+    <w:p/>
+    <w:p>
+      <w:r>
+        <w:t>Requirement ID: SR-02</w:t>
+      </w:r>
+    </w:p>
+    <w:p>
+      <w:r>
+        <w:t>Requirement Description: Validate user input</w:t>
+      </w:r>
+    </w:p>
+    <w:p>
+      <w:r>
+        <w:t>Related Use Case: UC-02, UC-10</w:t>
+      </w:r>
+    </w:p>
+    <w:p>
+      <w:r>
+        <w:t>Related Test Case: TC-16</w:t>
+      </w:r>
+    </w:p>
+    <w:p/>
+    <w:p>
+      <w:r>
+        <w:t>Requirement ID: LR-01</w:t>
+      </w:r>
+    </w:p>
+    <w:p>
+      <w:r>
+        <w:t>Requirement Description: Use safe simulated content only</w:t>
+      </w:r>
+    </w:p>
+    <w:p>
+      <w:r>
+        <w:t>Related Use Case: UC-05, UC-10</w:t>
+      </w:r>
+    </w:p>
+    <w:p>
+      <w:r>
+        <w:t>Related Test Case: TC-17</w:t>
       </w:r>
     </w:p>
     <w:sectPr>
@@ -2765,23 +5396,6 @@
 </file>
 
 <file path=customXml/item1.xml><?xml version="1.0" encoding="utf-8"?>
-<p:properties xmlns:p="http://schemas.microsoft.com/office/2006/metadata/properties" xmlns:xsi="http://www.w3.org/2001/XMLSchema-instance" xmlns:pc="http://schemas.microsoft.com/office/infopath/2007/PartnerControls">
-  <documentManagement>
-    <_activity xmlns="a609a35b-4020-4ca9-86b3-79b406f4dcd1" xsi:nil="true"/>
-  </documentManagement>
-</p:properties>
-</file>
-
-<file path=customXml/item2.xml><?xml version="1.0" encoding="utf-8"?>
-<?mso-contentType ?>
-<FormTemplates xmlns="http://schemas.microsoft.com/sharepoint/v3/contenttype/forms">
-  <Display>DocumentLibraryForm</Display>
-  <Edit>DocumentLibraryForm</Edit>
-  <New>DocumentLibraryForm</New>
-</FormTemplates>
-</file>
-
-<file path=customXml/item3.xml><?xml version="1.0" encoding="utf-8"?>
 <ct:contentTypeSchema xmlns:ct="http://schemas.microsoft.com/office/2006/metadata/contentType" xmlns:ma="http://schemas.microsoft.com/office/2006/metadata/properties/metaAttributes" ct:_="" ma:_="" ma:contentTypeName="Document" ma:contentTypeID="0x010100805D554111AF5C46A71298546EF302D7" ma:contentTypeVersion="9" ma:contentTypeDescription="Create a new document." ma:contentTypeScope="" ma:versionID="768f07144d0153a003ee90a9c08f86fd">
   <xsd:schema xmlns:xsd="http://www.w3.org/2001/XMLSchema" xmlns:xs="http://www.w3.org/2001/XMLSchema" xmlns:p="http://schemas.microsoft.com/office/2006/metadata/properties" xmlns:ns3="a609a35b-4020-4ca9-86b3-79b406f4dcd1" targetNamespace="http://schemas.microsoft.com/office/2006/metadata/properties" ma:root="true" ma:fieldsID="3757285bfd37d6838468995f416aad1a" ns3:_="">
     <xsd:import namespace="a609a35b-4020-4ca9-86b3-79b406f4dcd1"/>
@@ -2955,25 +5569,24 @@
 </ct:contentTypeSchema>
 </file>
 
-<file path=customXml/itemProps1.xml><?xml version="1.0" encoding="utf-8"?>
-<ds:datastoreItem xmlns:ds="http://schemas.openxmlformats.org/officeDocument/2006/customXml" ds:itemID="{55EF371C-6EBC-4ECE-AD45-86639B860533}">
-  <ds:schemaRefs>
-    <ds:schemaRef ds:uri="http://schemas.microsoft.com/office/2006/metadata/properties"/>
-    <ds:schemaRef ds:uri="http://schemas.microsoft.com/office/infopath/2007/PartnerControls"/>
-    <ds:schemaRef ds:uri="a609a35b-4020-4ca9-86b3-79b406f4dcd1"/>
-  </ds:schemaRefs>
-</ds:datastoreItem>
+<file path=customXml/item2.xml><?xml version="1.0" encoding="utf-8"?>
+<?mso-contentType ?>
+<FormTemplates xmlns="http://schemas.microsoft.com/sharepoint/v3/contenttype/forms">
+  <Display>DocumentLibraryForm</Display>
+  <Edit>DocumentLibraryForm</Edit>
+  <New>DocumentLibraryForm</New>
+</FormTemplates>
 </file>
 
-<file path=customXml/itemProps2.xml><?xml version="1.0" encoding="utf-8"?>
-<ds:datastoreItem xmlns:ds="http://schemas.openxmlformats.org/officeDocument/2006/customXml" ds:itemID="{B14FE021-7BB5-4527-A8CB-0E2AF13086C2}">
-  <ds:schemaRefs>
-    <ds:schemaRef ds:uri="http://schemas.microsoft.com/sharepoint/v3/contenttype/forms"/>
-  </ds:schemaRefs>
-</ds:datastoreItem>
+<file path=customXml/item3.xml><?xml version="1.0" encoding="utf-8"?>
+<p:properties xmlns:p="http://schemas.microsoft.com/office/2006/metadata/properties" xmlns:xsi="http://www.w3.org/2001/XMLSchema-instance" xmlns:pc="http://schemas.microsoft.com/office/infopath/2007/PartnerControls">
+  <documentManagement>
+    <_activity xmlns="a609a35b-4020-4ca9-86b3-79b406f4dcd1" xsi:nil="true"/>
+  </documentManagement>
+</p:properties>
 </file>
 
-<file path=customXml/itemProps3.xml><?xml version="1.0" encoding="utf-8"?>
+<file path=customXml/itemProps1.xml><?xml version="1.0" encoding="utf-8"?>
 <ds:datastoreItem xmlns:ds="http://schemas.openxmlformats.org/officeDocument/2006/customXml" ds:itemID="{3EA4B12C-5743-4950-A114-29E95063FD8F}">
   <ds:schemaRefs>
     <ds:schemaRef ds:uri="http://schemas.microsoft.com/office/2006/metadata/contentType"/>
@@ -2989,4 +5602,22 @@
     <ds:schemaRef ds:uri="http://schemas.microsoft.com/internal/obd"/>
   </ds:schemaRefs>
 </ds:datastoreItem>
+</file>
+
+<file path=customXml/itemProps2.xml><?xml version="1.0" encoding="utf-8"?>
+<ds:datastoreItem xmlns:ds="http://schemas.openxmlformats.org/officeDocument/2006/customXml" ds:itemID="{B14FE021-7BB5-4527-A8CB-0E2AF13086C2}">
+  <ds:schemaRefs>
+    <ds:schemaRef ds:uri="http://schemas.microsoft.com/sharepoint/v3/contenttype/forms"/>
+  </ds:schemaRefs>
+</ds:datastoreItem>
+</file>
+
+<file path=customXml/itemProps3.xml><?xml version="1.0" encoding="utf-8"?>
+<ds:datastoreItem xmlns:ds="http://schemas.openxmlformats.org/officeDocument/2006/customXml" ds:itemID="{55EF371C-6EBC-4ECE-AD45-86639B860533}">
+  <ds:schemaRefs>
+    <ds:schemaRef ds:uri="http://schemas.microsoft.com/office/2006/metadata/properties"/>
+    <ds:schemaRef ds:uri="http://schemas.microsoft.com/office/infopath/2007/PartnerControls"/>
+    <ds:schemaRef ds:uri="a609a35b-4020-4ca9-86b3-79b406f4dcd1"/>
+  </ds:schemaRefs>
+</ds:datastoreItem>
 </file>
</xml_diff>